<commit_message>
docs: complete acquisition experiment report and detail single-satellite design
</commit_message>
<xml_diff>
--- a/deliverables/模块实验报告/01_捕获模块实验报告.docx
+++ b/deliverables/模块实验报告/01_捕获模块实验报告.docx
@@ -41,52 +41,821 @@
     </w:p>
     <w:p>
       <w:pPr>
-        <w:pStyle w:val="1"/>
-        <w:rPr>
-          <w:lang w:eastAsia="zh-CN"/>
-        </w:rPr>
+        <w:spacing w:after="80" w:line="360" w:lineRule="exact"/>
+        <w:ind w:firstLine="482"/>
+        <w:jc w:val="both"/>
       </w:pPr>
       <w:r>
         <w:rPr>
-          <w:rFonts w:ascii="Times New Roman" w:eastAsia="黑体" w:hAnsi="Times New Roman"/>
-          <w:lang w:eastAsia="zh-CN"/>
+          <w:rFonts w:ascii="Times New Roman" w:hAnsi="Times New Roman" w:eastAsia="宋体"/>
+          <w:b w:val="0"/>
+          <w:color w:val="000000"/>
+          <w:sz w:val="24"/>
         </w:rPr>
-        <w:t xml:space="preserve">1 原捕获模块实验</w:t>
+        <w:t>本实验验证完整捕获链路的目标检出与移交，并使用教师单星信号观察码位置搜索和相关能量变化。结果按原 RTL 定向仿真、公开数据软件参考和本次单星 RTL 仿真分别列出。</w:t>
       </w:r>
+    </w:p>
+    <w:p>
+      <w:pPr>
+        <w:pStyle w:val="1"/>
+        <w:pageBreakBefore w:val="0"/>
+      </w:pPr>
+      <w:r>
+        <w:t>1 实验目的与条件</w:t>
+      </w:r>
+    </w:p>
+    <w:p>
+      <w:pPr>
+        <w:spacing w:after="80" w:line="360" w:lineRule="exact"/>
+        <w:ind w:firstLine="482"/>
+        <w:jc w:val="both"/>
+      </w:pPr>
       <w:r>
         <w:rPr>
-          <w:rFonts w:ascii="Times New Roman" w:eastAsia="黑体" w:hAnsi="Times New Roman"/>
-          <w:lang w:eastAsia="zh-CN"/>
+          <w:rFonts w:ascii="Times New Roman" w:hAnsi="Times New Roman" w:eastAsia="宋体"/>
+          <w:b w:val="0"/>
+          <w:color w:val="000000"/>
+          <w:sz w:val="24"/>
         </w:rPr>
-        <w:t/>
+        <w:t>实验首先检查目标卫星能否被检出、缺席卫星能否被拒判，以及捕获初值能否移交至跟踪通道；随后在固定单星条件下检查本地码对齐过程，验证对齐相关能量至少为未对齐能量的 100 倍。</w:t>
+      </w:r>
+    </w:p>
+    <w:tbl>
+      <w:tblPr>
+        <w:tblW w:type="auto" w:w="0"/>
+        <w:jc w:val="center"/>
+        <w:tblLayout w:type="fixed"/>
+        <w:tblLook w:firstColumn="1" w:firstRow="1" w:lastColumn="0" w:lastRow="0" w:noHBand="0" w:noVBand="1" w:val="04A0"/>
+        <w:tblBorders>
+          <w:top w:val="single" w:sz="4" w:color="D9D9D9"/>
+          <w:left w:val="single" w:sz="4" w:color="D9D9D9"/>
+          <w:bottom w:val="single" w:sz="4" w:color="D9D9D9"/>
+          <w:right w:val="single" w:sz="4" w:color="D9D9D9"/>
+          <w:insideH w:val="single" w:sz="4" w:color="D9D9D9"/>
+          <w:insideV w:val="single" w:sz="4" w:color="D9D9D9"/>
+        </w:tblBorders>
+        <w:tblCellMar>
+          <w:top w:w="75" w:type="dxa"/>
+          <w:bottom w:w="75" w:type="dxa"/>
+          <w:left w:w="100" w:type="dxa"/>
+          <w:right w:w="100" w:type="dxa"/>
+        </w:tblCellMar>
+      </w:tblPr>
+      <w:tblGrid>
+        <w:gridCol w:w="1701"/>
+        <w:gridCol w:w="3969"/>
+        <w:gridCol w:w="3402"/>
+      </w:tblGrid>
+      <w:tr>
+        <w:trPr>
+          <w:cantSplit/>
+          <w:tblHeader/>
+        </w:trPr>
+        <w:tc>
+          <w:tcPr>
+            <w:tcW w:type="dxa" w:w="1701"/>
+            <w:vAlign w:val="center"/>
+            <w:shd w:fill="F2F2F2"/>
+          </w:tcPr>
+          <w:p>
+            <w:pPr>
+              <w:spacing w:after="0" w:line="280" w:lineRule="exact"/>
+              <w:ind w:firstLine="0"/>
+              <w:jc w:val="center"/>
+            </w:pPr>
+            <w:r>
+              <w:rPr>
+                <w:rFonts w:ascii="Times New Roman" w:hAnsi="Times New Roman" w:eastAsia="宋体"/>
+                <w:b/>
+                <w:color w:val="000000"/>
+                <w:sz w:val="21"/>
+              </w:rPr>
+              <w:t>实验项目</w:t>
+            </w:r>
+          </w:p>
+        </w:tc>
+        <w:tc>
+          <w:tcPr>
+            <w:tcW w:type="dxa" w:w="3969"/>
+            <w:vAlign w:val="center"/>
+            <w:shd w:fill="F2F2F2"/>
+          </w:tcPr>
+          <w:p>
+            <w:pPr>
+              <w:spacing w:after="0" w:line="280" w:lineRule="exact"/>
+              <w:ind w:firstLine="0"/>
+              <w:jc w:val="center"/>
+            </w:pPr>
+            <w:r>
+              <w:rPr>
+                <w:rFonts w:ascii="Times New Roman" w:hAnsi="Times New Roman" w:eastAsia="宋体"/>
+                <w:b/>
+                <w:color w:val="000000"/>
+                <w:sz w:val="21"/>
+              </w:rPr>
+              <w:t>激励与条件</w:t>
+            </w:r>
+          </w:p>
+        </w:tc>
+        <w:tc>
+          <w:tcPr>
+            <w:tcW w:type="dxa" w:w="3402"/>
+            <w:vAlign w:val="center"/>
+            <w:shd w:fill="F2F2F2"/>
+          </w:tcPr>
+          <w:p>
+            <w:pPr>
+              <w:spacing w:after="0" w:line="280" w:lineRule="exact"/>
+              <w:ind w:firstLine="0"/>
+              <w:jc w:val="center"/>
+            </w:pPr>
+            <w:r>
+              <w:rPr>
+                <w:rFonts w:ascii="Times New Roman" w:hAnsi="Times New Roman" w:eastAsia="宋体"/>
+                <w:b/>
+                <w:color w:val="000000"/>
+                <w:sz w:val="21"/>
+              </w:rPr>
+              <w:t>结果来源</w:t>
+            </w:r>
+          </w:p>
+        </w:tc>
+      </w:tr>
+      <w:tr>
+        <w:trPr>
+          <w:cantSplit/>
+        </w:trPr>
+        <w:tc>
+          <w:tcPr>
+            <w:tcW w:type="dxa" w:w="1701"/>
+            <w:vAlign w:val="center"/>
+          </w:tcPr>
+          <w:p>
+            <w:pPr>
+              <w:spacing w:after="0" w:line="280" w:lineRule="exact"/>
+              <w:ind w:firstLine="0"/>
+              <w:jc w:val="left"/>
+            </w:pPr>
+            <w:r>
+              <w:rPr>
+                <w:rFonts w:ascii="Times New Roman" w:hAnsi="Times New Roman" w:eastAsia="宋体"/>
+                <w:b w:val="0"/>
+                <w:color w:val="000000"/>
+                <w:sz w:val="21"/>
+              </w:rPr>
+              <w:t>完整捕获 RTL</w:t>
+            </w:r>
+          </w:p>
+        </w:tc>
+        <w:tc>
+          <w:tcPr>
+            <w:tcW w:type="dxa" w:w="3969"/>
+            <w:vAlign w:val="center"/>
+          </w:tcPr>
+          <w:p>
+            <w:pPr>
+              <w:spacing w:after="0" w:line="280" w:lineRule="exact"/>
+              <w:ind w:firstLine="0"/>
+              <w:jc w:val="left"/>
+            </w:pPr>
+            <w:r>
+              <w:rPr>
+                <w:rFonts w:ascii="Times New Roman" w:hAnsi="Times New Roman" w:eastAsia="宋体"/>
+                <w:b w:val="0"/>
+                <w:color w:val="000000"/>
+                <w:sz w:val="21"/>
+              </w:rPr>
+              <w:t>PRN 10 为目标，PRN 28 为干扰；另搜缺席 PRN 6；5 个粗频点</w:t>
+            </w:r>
+          </w:p>
+        </w:tc>
+        <w:tc>
+          <w:tcPr>
+            <w:tcW w:type="dxa" w:w="3402"/>
+            <w:vAlign w:val="center"/>
+          </w:tcPr>
+          <w:p>
+            <w:pPr>
+              <w:spacing w:after="0" w:line="280" w:lineRule="exact"/>
+              <w:ind w:firstLine="0"/>
+              <w:jc w:val="left"/>
+            </w:pPr>
+            <w:r>
+              <w:rPr>
+                <w:rFonts w:ascii="Times New Roman" w:hAnsi="Times New Roman" w:eastAsia="宋体"/>
+                <w:b w:val="0"/>
+                <w:color w:val="000000"/>
+                <w:sz w:val="21"/>
+              </w:rPr>
+              <w:t>2026-10-13 已保存的定向仿真日志</w:t>
+            </w:r>
+          </w:p>
+        </w:tc>
+      </w:tr>
+      <w:tr>
+        <w:trPr>
+          <w:cantSplit/>
+        </w:trPr>
+        <w:tc>
+          <w:tcPr>
+            <w:tcW w:type="dxa" w:w="1701"/>
+            <w:vAlign w:val="center"/>
+          </w:tcPr>
+          <w:p>
+            <w:pPr>
+              <w:spacing w:after="0" w:line="280" w:lineRule="exact"/>
+              <w:ind w:firstLine="0"/>
+              <w:jc w:val="left"/>
+            </w:pPr>
+            <w:r>
+              <w:rPr>
+                <w:rFonts w:ascii="Times New Roman" w:hAnsi="Times New Roman" w:eastAsia="宋体"/>
+                <w:b w:val="0"/>
+                <w:color w:val="000000"/>
+                <w:sz w:val="21"/>
+              </w:rPr>
+              <w:t>公开数据软件参考</w:t>
+            </w:r>
+          </w:p>
+        </w:tc>
+        <w:tc>
+          <w:tcPr>
+            <w:tcW w:type="dxa" w:w="3969"/>
+            <w:vAlign w:val="center"/>
+          </w:tcPr>
+          <w:p>
+            <w:pPr>
+              <w:spacing w:after="0" w:line="280" w:lineRule="exact"/>
+              <w:ind w:firstLine="0"/>
+              <w:jc w:val="left"/>
+            </w:pPr>
+            <w:r>
+              <w:rPr>
+                <w:rFonts w:ascii="Times New Roman" w:hAnsi="Times New Roman" w:eastAsia="宋体"/>
+                <w:b w:val="0"/>
+                <w:color w:val="000000"/>
+                <w:sz w:val="21"/>
+              </w:rPr>
+              <w:t>公开 IF2 输入前 10 ms；PRN 1～63；−10～+10 kHz 粗搜索</w:t>
+            </w:r>
+          </w:p>
+        </w:tc>
+        <w:tc>
+          <w:tcPr>
+            <w:tcW w:type="dxa" w:w="3402"/>
+            <w:vAlign w:val="center"/>
+          </w:tcPr>
+          <w:p>
+            <w:pPr>
+              <w:spacing w:after="0" w:line="280" w:lineRule="exact"/>
+              <w:ind w:firstLine="0"/>
+              <w:jc w:val="left"/>
+            </w:pPr>
+            <w:r>
+              <w:rPr>
+                <w:rFonts w:ascii="Times New Roman" w:hAnsi="Times New Roman" w:eastAsia="宋体"/>
+                <w:b w:val="0"/>
+                <w:color w:val="000000"/>
+                <w:sz w:val="21"/>
+              </w:rPr>
+              <w:t>已保存的软件捕获复核记录</w:t>
+            </w:r>
+          </w:p>
+        </w:tc>
+      </w:tr>
+      <w:tr>
+        <w:trPr>
+          <w:cantSplit/>
+        </w:trPr>
+        <w:tc>
+          <w:tcPr>
+            <w:tcW w:type="dxa" w:w="1701"/>
+            <w:vAlign w:val="center"/>
+          </w:tcPr>
+          <w:p>
+            <w:pPr>
+              <w:spacing w:after="0" w:line="280" w:lineRule="exact"/>
+              <w:ind w:firstLine="0"/>
+              <w:jc w:val="left"/>
+            </w:pPr>
+            <w:r>
+              <w:rPr>
+                <w:rFonts w:ascii="Times New Roman" w:hAnsi="Times New Roman" w:eastAsia="宋体"/>
+                <w:b w:val="0"/>
+                <w:color w:val="000000"/>
+                <w:sz w:val="21"/>
+              </w:rPr>
+              <w:t>单星捕获 RTL</w:t>
+            </w:r>
+          </w:p>
+        </w:tc>
+        <w:tc>
+          <w:tcPr>
+            <w:tcW w:type="dxa" w:w="3969"/>
+            <w:vAlign w:val="center"/>
+          </w:tcPr>
+          <w:p>
+            <w:pPr>
+              <w:spacing w:after="0" w:line="280" w:lineRule="exact"/>
+              <w:ind w:firstLine="0"/>
+              <w:jc w:val="left"/>
+            </w:pPr>
+            <w:r>
+              <w:rPr>
+                <w:rFonts w:ascii="Times New Roman" w:hAnsi="Times New Roman" w:eastAsia="宋体"/>
+                <w:b w:val="0"/>
+                <w:color w:val="000000"/>
+                <w:sz w:val="21"/>
+              </w:rPr>
+              <w:t>教师 PRN 6；码起始位置 10；零多普勒；无噪声</w:t>
+            </w:r>
+          </w:p>
+        </w:tc>
+        <w:tc>
+          <w:tcPr>
+            <w:tcW w:type="dxa" w:w="3402"/>
+            <w:vAlign w:val="center"/>
+          </w:tcPr>
+          <w:p>
+            <w:pPr>
+              <w:spacing w:after="0" w:line="280" w:lineRule="exact"/>
+              <w:ind w:firstLine="0"/>
+              <w:jc w:val="left"/>
+            </w:pPr>
+            <w:r>
+              <w:rPr>
+                <w:rFonts w:ascii="Times New Roman" w:hAnsi="Times New Roman" w:eastAsia="宋体"/>
+                <w:b w:val="0"/>
+                <w:color w:val="000000"/>
+                <w:sz w:val="21"/>
+              </w:rPr>
+              <w:t>2026-10-19 本次重新执行的 RTL 仿真</w:t>
+            </w:r>
+          </w:p>
+        </w:tc>
+      </w:tr>
+    </w:tbl>
+    <w:p>
+      <w:pPr>
+        <w:spacing w:after="80" w:line="360" w:lineRule="exact" w:before="100"/>
+        <w:ind w:firstLine="482"/>
+        <w:jc w:val="both"/>
+      </w:pPr>
+      <w:r>
+        <w:rPr>
+          <w:rFonts w:ascii="Times New Roman" w:hAnsi="Times New Roman" w:eastAsia="宋体"/>
+          <w:b w:val="0"/>
+          <w:color w:val="000000"/>
+          <w:sz w:val="24"/>
+        </w:rPr>
+        <w:t>RTL 仿真工具为 ModelSim SE-64 10.5。两类输入的标称采样率均为 16.368 MHz，中频均为 4.092 MHz。原 IF2 编码对应 −3、−1、+1、+3；单星源为 2 位有符号补码，输出 −1、0、+1。两者采用各自的输入解释，不能直接互换量化表。</w:t>
       </w:r>
     </w:p>
     <w:p>
       <w:pPr>
         <w:pStyle w:val="21"/>
-        <w:rPr>
-          <w:lang w:eastAsia="zh-CN"/>
-        </w:rPr>
+        <w:pageBreakBefore w:val="0"/>
+      </w:pPr>
+      <w:r>
+        <w:t>1.1 检查方法</w:t>
+      </w:r>
+    </w:p>
+    <w:p>
+      <w:pPr>
+        <w:spacing w:after="80" w:line="360" w:lineRule="exact"/>
+        <w:ind w:firstLine="482"/>
+        <w:jc w:val="both"/>
       </w:pPr>
       <w:r>
         <w:rPr>
-          <w:rFonts w:ascii="Times New Roman" w:eastAsia="黑体" w:hAnsi="Times New Roman"/>
-          <w:lang w:eastAsia="zh-CN"/>
+          <w:rFonts w:ascii="Times New Roman" w:hAnsi="Times New Roman" w:eastAsia="宋体"/>
+          <w:b w:val="0"/>
+          <w:color w:val="000000"/>
+          <w:sz w:val="24"/>
         </w:rPr>
-        <w:t xml:space="preserve">1.1 仿真波形</w:t>
+        <w:t>完整捕获用例检查 found、搜索位置、多普勒结果和移交后的 locked。单星用例按有效样本逐轮核对：每轮必须含 16368 个样本，结果位置与能量在 dump 处更新，首次捕获后继续计算两个窗口。测试台使用参考码线核对接收结果，不向捕获电路提供真实起始位置。</w:t>
       </w:r>
+    </w:p>
+    <w:p>
+      <w:pPr>
+        <w:spacing w:after="80" w:line="300" w:lineRule="exact"/>
+        <w:ind w:firstLine="0"/>
+        <w:jc w:val="both"/>
+      </w:pPr>
       <w:r>
         <w:rPr>
-          <w:rFonts w:ascii="Times New Roman" w:eastAsia="黑体" w:hAnsi="Times New Roman"/>
-          <w:lang w:eastAsia="zh-CN"/>
+          <w:rFonts w:ascii="Times New Roman" w:hAnsi="Times New Roman" w:eastAsia="宋体"/>
+          <w:b w:val="0"/>
+          <w:color w:val="000000"/>
+          <w:sz w:val="22"/>
         </w:rPr>
-        <w:t/>
+        <w:t>本报告中的数值来自实际执行或已保存的 RTL 仿真与软件计算，属于仿真结果；未进行硬件板级测量。历史结果保留原来源，不作为本次重新运行完整接收机的结论。</w:t>
+      </w:r>
+    </w:p>
+    <w:p>
+      <w:pPr>
+        <w:pStyle w:val="1"/>
+        <w:pageBreakBefore/>
+      </w:pPr>
+      <w:r>
+        <w:t>2 原捕获模块仿真</w:t>
+      </w:r>
+    </w:p>
+    <w:p>
+      <w:pPr>
+        <w:pStyle w:val="21"/>
+        <w:pageBreakBefore w:val="0"/>
+      </w:pPr>
+      <w:r>
+        <w:t>2.1 激励与操作过程</w:t>
+      </w:r>
+    </w:p>
+    <w:p>
+      <w:pPr>
+        <w:spacing w:after="80" w:line="360" w:lineRule="exact"/>
+        <w:ind w:firstLine="482"/>
+        <w:jc w:val="both"/>
+      </w:pPr>
+      <w:r>
+        <w:rPr>
+          <w:rFonts w:ascii="Times New Roman" w:hAnsi="Times New Roman" w:eastAsia="宋体"/>
+          <w:b w:val="0"/>
+          <w:color w:val="000000"/>
+          <w:sz w:val="24"/>
+        </w:rPr>
+        <w:t>原定向用例生成 650 ms 两星中频输入，目标 PRN 10 的 C/N₀ 为 45 dB-Hz，并叠加 PRN 28。粗搜索配置为 −500～+1500 Hz 共 5 个频点，步长约 500 Hz；采用 1 ms×2 积分，幅度峰均比门限为 3.5。目标检出后，将捕获状态装入跟踪通道并继续闭环运行。</w:t>
+      </w:r>
+    </w:p>
+    <w:p>
+      <w:pPr>
+        <w:spacing w:after="80" w:line="360" w:lineRule="exact"/>
+        <w:ind w:firstLine="482"/>
+        <w:jc w:val="both"/>
+      </w:pPr>
+      <w:r>
+        <w:rPr>
+          <w:rFonts w:ascii="Times New Roman" w:hAnsi="Times New Roman" w:eastAsia="宋体"/>
+          <w:b w:val="0"/>
+          <w:color w:val="000000"/>
+          <w:sz w:val="24"/>
+        </w:rPr>
+        <w:t>在项目根目录执行 python scripts/run_rtl_unit.py acquisition --sim modelsim 可复现该定向测试。观察搜索结束时的 found、res_h、res_dop、res_peak 与 res_mean，并继续检查 ready 和跟踪通道 locked。</w:t>
+      </w:r>
+    </w:p>
+    <w:p>
+      <w:pPr>
+        <w:pStyle w:val="21"/>
+        <w:pageBreakBefore w:val="0"/>
+      </w:pPr>
+      <w:r>
+        <w:t>2.2 结果与分析</w:t>
       </w:r>
     </w:p>
     <w:tbl>
       <w:tblPr>
-        <w:tblW w:w="9070" w:type="dxa"/>
+        <w:tblW w:type="auto" w:w="0"/>
+        <w:jc w:val="center"/>
         <w:tblLayout w:type="fixed"/>
+        <w:tblLook w:firstColumn="1" w:firstRow="1" w:lastColumn="0" w:lastRow="0" w:noHBand="0" w:noVBand="1" w:val="04A0"/>
+        <w:tblBorders>
+          <w:top w:val="single" w:sz="4" w:color="D9D9D9"/>
+          <w:left w:val="single" w:sz="4" w:color="D9D9D9"/>
+          <w:bottom w:val="single" w:sz="4" w:color="D9D9D9"/>
+          <w:right w:val="single" w:sz="4" w:color="D9D9D9"/>
+          <w:insideH w:val="single" w:sz="4" w:color="D9D9D9"/>
+          <w:insideV w:val="single" w:sz="4" w:color="D9D9D9"/>
+        </w:tblBorders>
+        <w:tblCellMar>
+          <w:top w:w="75" w:type="dxa"/>
+          <w:bottom w:w="75" w:type="dxa"/>
+          <w:left w:w="100" w:type="dxa"/>
+          <w:right w:w="100" w:type="dxa"/>
+        </w:tblCellMar>
+      </w:tblPr>
+      <w:tblGrid>
+        <w:gridCol w:w="2324"/>
+        <w:gridCol w:w="6746"/>
+      </w:tblGrid>
+      <w:tr>
+        <w:trPr>
+          <w:cantSplit/>
+          <w:tblHeader/>
+        </w:trPr>
+        <w:tc>
+          <w:tcPr>
+            <w:tcW w:type="dxa" w:w="2324"/>
+            <w:vAlign w:val="center"/>
+            <w:shd w:fill="F2F2F2"/>
+          </w:tcPr>
+          <w:p>
+            <w:pPr>
+              <w:spacing w:after="0" w:line="280" w:lineRule="exact"/>
+              <w:ind w:firstLine="0"/>
+              <w:jc w:val="center"/>
+            </w:pPr>
+            <w:r>
+              <w:rPr>
+                <w:rFonts w:ascii="Times New Roman" w:hAnsi="Times New Roman" w:eastAsia="宋体"/>
+                <w:b/>
+                <w:color w:val="000000"/>
+                <w:sz w:val="21"/>
+              </w:rPr>
+              <w:t>检查项</w:t>
+            </w:r>
+          </w:p>
+        </w:tc>
+        <w:tc>
+          <w:tcPr>
+            <w:tcW w:type="dxa" w:w="6746"/>
+            <w:vAlign w:val="center"/>
+            <w:shd w:fill="F2F2F2"/>
+          </w:tcPr>
+          <w:p>
+            <w:pPr>
+              <w:spacing w:after="0" w:line="280" w:lineRule="exact"/>
+              <w:ind w:firstLine="0"/>
+              <w:jc w:val="center"/>
+            </w:pPr>
+            <w:r>
+              <w:rPr>
+                <w:rFonts w:ascii="Times New Roman" w:hAnsi="Times New Roman" w:eastAsia="宋体"/>
+                <w:b/>
+                <w:color w:val="000000"/>
+                <w:sz w:val="21"/>
+              </w:rPr>
+              <w:t>保存的仿真结果</w:t>
+            </w:r>
+          </w:p>
+        </w:tc>
+      </w:tr>
+      <w:tr>
+        <w:trPr>
+          <w:cantSplit/>
+        </w:trPr>
+        <w:tc>
+          <w:tcPr>
+            <w:tcW w:type="dxa" w:w="2324"/>
+            <w:vAlign w:val="center"/>
+          </w:tcPr>
+          <w:p>
+            <w:pPr>
+              <w:spacing w:after="0" w:line="280" w:lineRule="exact"/>
+              <w:ind w:firstLine="0"/>
+              <w:jc w:val="left"/>
+            </w:pPr>
+            <w:r>
+              <w:rPr>
+                <w:rFonts w:ascii="Times New Roman" w:hAnsi="Times New Roman" w:eastAsia="宋体"/>
+                <w:b w:val="0"/>
+                <w:color w:val="000000"/>
+                <w:sz w:val="21"/>
+              </w:rPr>
+              <w:t>目标检出</w:t>
+            </w:r>
+          </w:p>
+        </w:tc>
+        <w:tc>
+          <w:tcPr>
+            <w:tcW w:type="dxa" w:w="6746"/>
+            <w:vAlign w:val="center"/>
+          </w:tcPr>
+          <w:p>
+            <w:pPr>
+              <w:spacing w:after="0" w:line="280" w:lineRule="exact"/>
+              <w:ind w:firstLine="0"/>
+              <w:jc w:val="left"/>
+            </w:pPr>
+            <w:r>
+              <w:rPr>
+                <w:rFonts w:ascii="Times New Roman" w:hAnsi="Times New Roman" w:eastAsia="宋体"/>
+                <w:b w:val="0"/>
+                <w:color w:val="000000"/>
+                <w:sz w:val="21"/>
+              </w:rPr>
+              <w:t>found=1；半码片位置 h=3192；多普勒频率字 65600</w:t>
+            </w:r>
+          </w:p>
+        </w:tc>
+      </w:tr>
+      <w:tr>
+        <w:trPr>
+          <w:cantSplit/>
+        </w:trPr>
+        <w:tc>
+          <w:tcPr>
+            <w:tcW w:type="dxa" w:w="2324"/>
+            <w:vAlign w:val="center"/>
+          </w:tcPr>
+          <w:p>
+            <w:pPr>
+              <w:spacing w:after="0" w:line="280" w:lineRule="exact"/>
+              <w:ind w:firstLine="0"/>
+              <w:jc w:val="left"/>
+            </w:pPr>
+            <w:r>
+              <w:rPr>
+                <w:rFonts w:ascii="Times New Roman" w:hAnsi="Times New Roman" w:eastAsia="宋体"/>
+                <w:b w:val="0"/>
+                <w:color w:val="000000"/>
+                <w:sz w:val="21"/>
+              </w:rPr>
+              <w:t>判决统计量</w:t>
+            </w:r>
+          </w:p>
+        </w:tc>
+        <w:tc>
+          <w:tcPr>
+            <w:tcW w:type="dxa" w:w="6746"/>
+            <w:vAlign w:val="center"/>
+          </w:tcPr>
+          <w:p>
+            <w:pPr>
+              <w:spacing w:after="0" w:line="280" w:lineRule="exact"/>
+              <w:ind w:firstLine="0"/>
+              <w:jc w:val="left"/>
+            </w:pPr>
+            <w:r>
+              <w:rPr>
+                <w:rFonts w:ascii="Times New Roman" w:hAnsi="Times New Roman" w:eastAsia="宋体"/>
+                <w:b w:val="0"/>
+                <w:color w:val="000000"/>
+                <w:sz w:val="21"/>
+              </w:rPr>
+              <w:t>峰值 1 013 221；均值 210 098；峰均比约 4.82，大于 3.5</w:t>
+            </w:r>
+          </w:p>
+        </w:tc>
+      </w:tr>
+      <w:tr>
+        <w:trPr>
+          <w:cantSplit/>
+        </w:trPr>
+        <w:tc>
+          <w:tcPr>
+            <w:tcW w:type="dxa" w:w="2324"/>
+            <w:vAlign w:val="center"/>
+          </w:tcPr>
+          <w:p>
+            <w:pPr>
+              <w:spacing w:after="0" w:line="280" w:lineRule="exact"/>
+              <w:ind w:firstLine="0"/>
+              <w:jc w:val="left"/>
+            </w:pPr>
+            <w:r>
+              <w:rPr>
+                <w:rFonts w:ascii="Times New Roman" w:hAnsi="Times New Roman" w:eastAsia="宋体"/>
+                <w:b w:val="0"/>
+                <w:color w:val="000000"/>
+                <w:sz w:val="21"/>
+              </w:rPr>
+              <w:t>捕获与移交</w:t>
+            </w:r>
+          </w:p>
+        </w:tc>
+        <w:tc>
+          <w:tcPr>
+            <w:tcW w:type="dxa" w:w="6746"/>
+            <w:vAlign w:val="center"/>
+          </w:tcPr>
+          <w:p>
+            <w:pPr>
+              <w:spacing w:after="0" w:line="280" w:lineRule="exact"/>
+              <w:ind w:firstLine="0"/>
+              <w:jc w:val="left"/>
+            </w:pPr>
+            <w:r>
+              <w:rPr>
+                <w:rFonts w:ascii="Times New Roman" w:hAnsi="Times New Roman" w:eastAsia="宋体"/>
+                <w:b w:val="0"/>
+                <w:color w:val="000000"/>
+                <w:sz w:val="21"/>
+              </w:rPr>
+              <w:t>累计 1 791 804 个输入样本处完成捕获；约 109 ms 移交</w:t>
+            </w:r>
+          </w:p>
+        </w:tc>
+      </w:tr>
+      <w:tr>
+        <w:trPr>
+          <w:cantSplit/>
+        </w:trPr>
+        <w:tc>
+          <w:tcPr>
+            <w:tcW w:type="dxa" w:w="2324"/>
+            <w:vAlign w:val="center"/>
+          </w:tcPr>
+          <w:p>
+            <w:pPr>
+              <w:spacing w:after="0" w:line="280" w:lineRule="exact"/>
+              <w:ind w:firstLine="0"/>
+              <w:jc w:val="left"/>
+            </w:pPr>
+            <w:r>
+              <w:rPr>
+                <w:rFonts w:ascii="Times New Roman" w:hAnsi="Times New Roman" w:eastAsia="宋体"/>
+                <w:b w:val="0"/>
+                <w:color w:val="000000"/>
+                <w:sz w:val="21"/>
+              </w:rPr>
+              <w:t>移交后闭环</w:t>
+            </w:r>
+          </w:p>
+        </w:tc>
+        <w:tc>
+          <w:tcPr>
+            <w:tcW w:type="dxa" w:w="6746"/>
+            <w:vAlign w:val="center"/>
+          </w:tcPr>
+          <w:p>
+            <w:pPr>
+              <w:spacing w:after="0" w:line="280" w:lineRule="exact"/>
+              <w:ind w:firstLine="0"/>
+              <w:jc w:val="left"/>
+            </w:pPr>
+            <w:r>
+              <w:rPr>
+                <w:rFonts w:ascii="Times New Roman" w:hAnsi="Times New Roman" w:eastAsia="宋体"/>
+                <w:b w:val="0"/>
+                <w:color w:val="000000"/>
+                <w:sz w:val="21"/>
+              </w:rPr>
+              <w:t>继续跟踪 300 ms 后 locked=1；码相位误差 0.0058 chip</w:t>
+            </w:r>
+          </w:p>
+        </w:tc>
+      </w:tr>
+      <w:tr>
+        <w:trPr>
+          <w:cantSplit/>
+        </w:trPr>
+        <w:tc>
+          <w:tcPr>
+            <w:tcW w:type="dxa" w:w="2324"/>
+            <w:vAlign w:val="center"/>
+          </w:tcPr>
+          <w:p>
+            <w:pPr>
+              <w:spacing w:after="0" w:line="280" w:lineRule="exact"/>
+              <w:ind w:firstLine="0"/>
+              <w:jc w:val="left"/>
+            </w:pPr>
+            <w:r>
+              <w:rPr>
+                <w:rFonts w:ascii="Times New Roman" w:hAnsi="Times New Roman" w:eastAsia="宋体"/>
+                <w:b w:val="0"/>
+                <w:color w:val="000000"/>
+                <w:sz w:val="21"/>
+              </w:rPr>
+              <w:t>缺席 PRN 6</w:t>
+            </w:r>
+          </w:p>
+        </w:tc>
+        <w:tc>
+          <w:tcPr>
+            <w:tcW w:type="dxa" w:w="6746"/>
+            <w:vAlign w:val="center"/>
+          </w:tcPr>
+          <w:p>
+            <w:pPr>
+              <w:spacing w:after="0" w:line="280" w:lineRule="exact"/>
+              <w:ind w:firstLine="0"/>
+              <w:jc w:val="left"/>
+            </w:pPr>
+            <w:r>
+              <w:rPr>
+                <w:rFonts w:ascii="Times New Roman" w:hAnsi="Times New Roman" w:eastAsia="宋体"/>
+                <w:b w:val="0"/>
+                <w:color w:val="000000"/>
+                <w:sz w:val="21"/>
+              </w:rPr>
+              <w:t>found=0；峰值 656 283、均值 207 882；峰均比约 3.16</w:t>
+            </w:r>
+          </w:p>
+        </w:tc>
+      </w:tr>
+    </w:tbl>
+    <w:p>
+      <w:pPr>
+        <w:spacing w:after="80" w:line="300" w:lineRule="exact" w:before="100"/>
+        <w:ind w:firstLine="0"/>
+        <w:jc w:val="both"/>
+      </w:pPr>
+      <w:r>
+        <w:rPr>
+          <w:rFonts w:ascii="Times New Roman" w:hAnsi="Times New Roman" w:eastAsia="宋体"/>
+          <w:b w:val="0"/>
+          <w:color w:val="000000"/>
+          <w:sz w:val="22"/>
+        </w:rPr>
+        <w:t>目标峰均比高于门限，缺席码的峰均比低于门限，说明该激励下目标检出和拒判符合配置。移交后环路进入锁定，且码误差较小，表明搜索结果的参考时刻、码相位符号和状态装载在该用例中相互一致。单次缺席码拒判不能用于估计虚警概率。</w:t>
+      </w:r>
+    </w:p>
+    <w:tbl>
+      <w:tblPr>
+        <w:tblW w:type="auto" w:w="0"/>
+        <w:jc w:val="center"/>
+        <w:tblLayout w:type="fixed"/>
+        <w:tblLook w:firstColumn="1" w:firstRow="1" w:lastColumn="0" w:lastRow="0" w:noHBand="0" w:noVBand="1" w:val="04A0"/>
         <w:tblBorders>
           <w:top w:val="single" w:sz="4" w:color="D9D9D9"/>
           <w:left w:val="single" w:sz="4" w:color="D9D9D9"/>
@@ -95,22 +864,16 @@
         </w:tblBorders>
       </w:tblPr>
       <w:tblGrid>
-        <w:gridCol w:w="9070"/>
+        <w:gridCol w:w="8901"/>
       </w:tblGrid>
       <w:tr>
         <w:trPr>
+          <w:trHeight w:val="2948" w:hRule="atLeast"/>
           <w:cantSplit/>
-          <w:trHeight w:val="5386" w:hRule="atLeast"/>
         </w:trPr>
         <w:tc>
           <w:tcPr>
-            <w:tcW w:w="9070" w:type="dxa"/>
-            <w:tcMar>
-              <w:top w:w="100" w:type="dxa"/>
-              <w:left w:w="100" w:type="dxa"/>
-              <w:bottom w:w="100" w:type="dxa"/>
-              <w:right w:w="100" w:type="dxa"/>
-            </w:tcMar>
+            <w:tcW w:type="dxa" w:w="8901"/>
           </w:tcPr>
           <w:p/>
         </w:tc>
@@ -118,95 +881,3097 @@
     </w:tbl>
     <w:p>
       <w:pPr>
-        <w:spacing w:after="240" w:line="240" w:lineRule="auto"/>
-        <w:ind w:firstLine="482"/>
-        <w:jc w:val="both"/>
-        <w:rPr>
-          <w:lang w:eastAsia="zh-CN"/>
-        </w:rPr>
-      </w:pPr>
-    </w:p>
-    <w:p>
-      <w:pPr>
-        <w:pStyle w:val="21"/>
-        <w:rPr>
-          <w:lang w:eastAsia="zh-CN"/>
-        </w:rPr>
+        <w:spacing w:after="80" w:line="300" w:lineRule="exact" w:before="80"/>
+        <w:ind w:firstLine="0"/>
+        <w:jc w:val="center"/>
       </w:pPr>
       <w:r>
         <w:rPr>
-          <w:rFonts w:ascii="Times New Roman" w:eastAsia="黑体" w:hAnsi="Times New Roman"/>
-          <w:lang w:eastAsia="zh-CN"/>
+          <w:rFonts w:ascii="Times New Roman" w:hAnsi="Times New Roman" w:eastAsia="宋体"/>
+          <w:b w:val="0"/>
+          <w:color w:val="000000"/>
+          <w:sz w:val="19"/>
         </w:rPr>
-        <w:t xml:space="preserve">1.2 实验结果与分析</w:t>
-      </w:r>
-      <w:r>
-        <w:rPr>
-          <w:rFonts w:ascii="Times New Roman" w:eastAsia="黑体" w:hAnsi="Times New Roman"/>
-          <w:lang w:eastAsia="zh-CN"/>
-        </w:rPr>
-        <w:t/>
+        <w:t>图 1　原捕获模块的搜索结束与移交波形  待插入仿真截图</w:t>
       </w:r>
     </w:p>
     <w:p>
       <w:pPr>
-        <w:spacing w:after="1200" w:line="240" w:lineRule="auto"/>
-        <w:ind w:firstLine="482"/>
+        <w:spacing w:after="80" w:line="300" w:lineRule="exact"/>
+        <w:ind w:firstLine="0"/>
         <w:jc w:val="both"/>
+      </w:pPr>
+      <w:r>
         <w:rPr>
-          <w:lang w:eastAsia="zh-CN"/>
+          <w:rFonts w:ascii="Times New Roman" w:hAnsi="Times New Roman" w:eastAsia="宋体"/>
+          <w:b w:val="0"/>
+          <w:color w:val="000000"/>
+          <w:sz w:val="21"/>
         </w:rPr>
-      </w:pPr>
+        <w:t>图 1 记录目标搜索结束时 found=1，以及相位、频率和判决统计量；展示移交时同时记录 ready 与跟踪锁定信号。本图对应原两星定向用例，单星观测见图 2～图 4。</w:t>
+      </w:r>
     </w:p>
     <w:p>
       <w:pPr>
         <w:pStyle w:val="1"/>
-        <w:rPr>
-          <w:lang w:eastAsia="zh-CN"/>
-        </w:rPr>
         <w:pageBreakBefore/>
       </w:pPr>
       <w:r>
-        <w:rPr>
-          <w:rFonts w:ascii="Times New Roman" w:eastAsia="黑体" w:hAnsi="Times New Roman"/>
-          <w:lang w:eastAsia="zh-CN"/>
-        </w:rPr>
-        <w:t xml:space="preserve">2 单星捕获实验</w:t>
+        <w:t>3 公开数据的软件参考对照</w:t>
       </w:r>
+    </w:p>
+    <w:p>
+      <w:pPr>
+        <w:spacing w:after="80" w:line="360" w:lineRule="exact"/>
+        <w:ind w:firstLine="482"/>
+        <w:jc w:val="both"/>
+      </w:pPr>
       <w:r>
         <w:rPr>
-          <w:rFonts w:ascii="Times New Roman" w:eastAsia="黑体" w:hAnsi="Times New Roman"/>
-          <w:lang w:eastAsia="zh-CN"/>
+          <w:rFonts w:ascii="Times New Roman" w:hAnsi="Times New Roman" w:eastAsia="宋体"/>
+          <w:b w:val="0"/>
+          <w:color w:val="000000"/>
+          <w:sz w:val="24"/>
         </w:rPr>
-        <w:t/>
+        <w:t>软件对照使用公开 IF2 文件起始 10 ms 数据，在 PRN 1～63 和 −10～+10 kHz 范围内搜索，粗频点间隔为 500 Hz。每个频点计算 4092 个循环码延迟假设，并将 10 个 1 ms 窗口的相关功率非相干累加。判定指标为功率峰次峰比，门限为 2.5。</w:t>
+      </w:r>
+    </w:p>
+    <w:tbl>
+      <w:tblPr>
+        <w:tblW w:type="auto" w:w="0"/>
+        <w:jc w:val="center"/>
+        <w:tblLayout w:type="fixed"/>
+        <w:tblLook w:firstColumn="1" w:firstRow="1" w:lastColumn="0" w:lastRow="0" w:noHBand="0" w:noVBand="1" w:val="04A0"/>
+        <w:tblBorders>
+          <w:top w:val="single" w:sz="4" w:color="D9D9D9"/>
+          <w:left w:val="single" w:sz="4" w:color="D9D9D9"/>
+          <w:bottom w:val="single" w:sz="4" w:color="D9D9D9"/>
+          <w:right w:val="single" w:sz="4" w:color="D9D9D9"/>
+          <w:insideH w:val="single" w:sz="4" w:color="D9D9D9"/>
+          <w:insideV w:val="single" w:sz="4" w:color="D9D9D9"/>
+        </w:tblBorders>
+        <w:tblCellMar>
+          <w:top w:w="75" w:type="dxa"/>
+          <w:bottom w:w="75" w:type="dxa"/>
+          <w:left w:w="100" w:type="dxa"/>
+          <w:right w:w="100" w:type="dxa"/>
+        </w:tblCellMar>
+      </w:tblPr>
+      <w:tblGrid>
+        <w:gridCol w:w="1134"/>
+        <w:gridCol w:w="2268"/>
+        <w:gridCol w:w="2835"/>
+        <w:gridCol w:w="2835"/>
+      </w:tblGrid>
+      <w:tr>
+        <w:trPr>
+          <w:cantSplit/>
+          <w:tblHeader/>
+        </w:trPr>
+        <w:tc>
+          <w:tcPr>
+            <w:tcW w:type="dxa" w:w="1134"/>
+            <w:vAlign w:val="center"/>
+            <w:shd w:fill="F2F2F2"/>
+          </w:tcPr>
+          <w:p>
+            <w:pPr>
+              <w:spacing w:after="0" w:line="280" w:lineRule="exact"/>
+              <w:ind w:firstLine="0"/>
+              <w:jc w:val="center"/>
+            </w:pPr>
+            <w:r>
+              <w:rPr>
+                <w:rFonts w:ascii="Times New Roman" w:hAnsi="Times New Roman" w:eastAsia="宋体"/>
+                <w:b/>
+                <w:color w:val="000000"/>
+                <w:sz w:val="21"/>
+              </w:rPr>
+              <w:t>PRN</w:t>
+            </w:r>
+          </w:p>
+        </w:tc>
+        <w:tc>
+          <w:tcPr>
+            <w:tcW w:type="dxa" w:w="2268"/>
+            <w:vAlign w:val="center"/>
+            <w:shd w:fill="F2F2F2"/>
+          </w:tcPr>
+          <w:p>
+            <w:pPr>
+              <w:spacing w:after="0" w:line="280" w:lineRule="exact"/>
+              <w:ind w:firstLine="0"/>
+              <w:jc w:val="center"/>
+            </w:pPr>
+            <w:r>
+              <w:rPr>
+                <w:rFonts w:ascii="Times New Roman" w:hAnsi="Times New Roman" w:eastAsia="宋体"/>
+                <w:b/>
+                <w:color w:val="000000"/>
+                <w:sz w:val="21"/>
+              </w:rPr>
+              <w:t>粗多普勒 Hz</w:t>
+            </w:r>
+          </w:p>
+        </w:tc>
+        <w:tc>
+          <w:tcPr>
+            <w:tcW w:type="dxa" w:w="2835"/>
+            <w:vAlign w:val="center"/>
+            <w:shd w:fill="F2F2F2"/>
+          </w:tcPr>
+          <w:p>
+            <w:pPr>
+              <w:spacing w:after="0" w:line="280" w:lineRule="exact"/>
+              <w:ind w:firstLine="0"/>
+              <w:jc w:val="center"/>
+            </w:pPr>
+            <w:r>
+              <w:rPr>
+                <w:rFonts w:ascii="Times New Roman" w:hAnsi="Times New Roman" w:eastAsia="宋体"/>
+                <w:b/>
+                <w:color w:val="000000"/>
+                <w:sz w:val="21"/>
+              </w:rPr>
+              <w:t>循环延迟 样本</w:t>
+            </w:r>
+          </w:p>
+        </w:tc>
+        <w:tc>
+          <w:tcPr>
+            <w:tcW w:type="dxa" w:w="2835"/>
+            <w:vAlign w:val="center"/>
+            <w:shd w:fill="F2F2F2"/>
+          </w:tcPr>
+          <w:p>
+            <w:pPr>
+              <w:spacing w:after="0" w:line="280" w:lineRule="exact"/>
+              <w:ind w:firstLine="0"/>
+              <w:jc w:val="center"/>
+            </w:pPr>
+            <w:r>
+              <w:rPr>
+                <w:rFonts w:ascii="Times New Roman" w:hAnsi="Times New Roman" w:eastAsia="宋体"/>
+                <w:b/>
+                <w:color w:val="000000"/>
+                <w:sz w:val="21"/>
+              </w:rPr>
+              <w:t>功率峰次峰比</w:t>
+            </w:r>
+          </w:p>
+        </w:tc>
+      </w:tr>
+      <w:tr>
+        <w:trPr>
+          <w:cantSplit/>
+        </w:trPr>
+        <w:tc>
+          <w:tcPr>
+            <w:tcW w:type="dxa" w:w="1134"/>
+            <w:vAlign w:val="center"/>
+          </w:tcPr>
+          <w:p>
+            <w:pPr>
+              <w:spacing w:after="0" w:line="280" w:lineRule="exact"/>
+              <w:ind w:firstLine="0"/>
+              <w:jc w:val="center"/>
+            </w:pPr>
+            <w:r>
+              <w:rPr>
+                <w:rFonts w:ascii="Times New Roman" w:hAnsi="Times New Roman" w:eastAsia="宋体"/>
+                <w:b w:val="0"/>
+                <w:color w:val="000000"/>
+                <w:sz w:val="21"/>
+              </w:rPr>
+              <w:t>8</w:t>
+            </w:r>
+          </w:p>
+        </w:tc>
+        <w:tc>
+          <w:tcPr>
+            <w:tcW w:type="dxa" w:w="2268"/>
+            <w:vAlign w:val="center"/>
+          </w:tcPr>
+          <w:p>
+            <w:pPr>
+              <w:spacing w:after="0" w:line="280" w:lineRule="exact"/>
+              <w:ind w:firstLine="0"/>
+              <w:jc w:val="center"/>
+            </w:pPr>
+            <w:r>
+              <w:rPr>
+                <w:rFonts w:ascii="Times New Roman" w:hAnsi="Times New Roman" w:eastAsia="宋体"/>
+                <w:b w:val="0"/>
+                <w:color w:val="000000"/>
+                <w:sz w:val="21"/>
+              </w:rPr>
+              <w:t>+500</w:t>
+            </w:r>
+          </w:p>
+        </w:tc>
+        <w:tc>
+          <w:tcPr>
+            <w:tcW w:type="dxa" w:w="2835"/>
+            <w:vAlign w:val="center"/>
+          </w:tcPr>
+          <w:p>
+            <w:pPr>
+              <w:spacing w:after="0" w:line="280" w:lineRule="exact"/>
+              <w:ind w:firstLine="0"/>
+              <w:jc w:val="center"/>
+            </w:pPr>
+            <w:r>
+              <w:rPr>
+                <w:rFonts w:ascii="Times New Roman" w:hAnsi="Times New Roman" w:eastAsia="宋体"/>
+                <w:b w:val="0"/>
+                <w:color w:val="000000"/>
+                <w:sz w:val="21"/>
+              </w:rPr>
+              <w:t>12603</w:t>
+            </w:r>
+          </w:p>
+        </w:tc>
+        <w:tc>
+          <w:tcPr>
+            <w:tcW w:type="dxa" w:w="2835"/>
+            <w:vAlign w:val="center"/>
+          </w:tcPr>
+          <w:p>
+            <w:pPr>
+              <w:spacing w:after="0" w:line="280" w:lineRule="exact"/>
+              <w:ind w:firstLine="0"/>
+              <w:jc w:val="center"/>
+            </w:pPr>
+            <w:r>
+              <w:rPr>
+                <w:rFonts w:ascii="Times New Roman" w:hAnsi="Times New Roman" w:eastAsia="宋体"/>
+                <w:b w:val="0"/>
+                <w:color w:val="000000"/>
+                <w:sz w:val="21"/>
+              </w:rPr>
+              <w:t>6.61</w:t>
+            </w:r>
+          </w:p>
+        </w:tc>
+      </w:tr>
+      <w:tr>
+        <w:trPr>
+          <w:cantSplit/>
+        </w:trPr>
+        <w:tc>
+          <w:tcPr>
+            <w:tcW w:type="dxa" w:w="1134"/>
+            <w:vAlign w:val="center"/>
+          </w:tcPr>
+          <w:p>
+            <w:pPr>
+              <w:spacing w:after="0" w:line="280" w:lineRule="exact"/>
+              <w:ind w:firstLine="0"/>
+              <w:jc w:val="center"/>
+            </w:pPr>
+            <w:r>
+              <w:rPr>
+                <w:rFonts w:ascii="Times New Roman" w:hAnsi="Times New Roman" w:eastAsia="宋体"/>
+                <w:b w:val="0"/>
+                <w:color w:val="000000"/>
+                <w:sz w:val="21"/>
+              </w:rPr>
+              <w:t>11</w:t>
+            </w:r>
+          </w:p>
+        </w:tc>
+        <w:tc>
+          <w:tcPr>
+            <w:tcW w:type="dxa" w:w="2268"/>
+            <w:vAlign w:val="center"/>
+          </w:tcPr>
+          <w:p>
+            <w:pPr>
+              <w:spacing w:after="0" w:line="280" w:lineRule="exact"/>
+              <w:ind w:firstLine="0"/>
+              <w:jc w:val="center"/>
+            </w:pPr>
+            <w:r>
+              <w:rPr>
+                <w:rFonts w:ascii="Times New Roman" w:hAnsi="Times New Roman" w:eastAsia="宋体"/>
+                <w:b w:val="0"/>
+                <w:color w:val="000000"/>
+                <w:sz w:val="21"/>
+              </w:rPr>
+              <w:t>-3000</w:t>
+            </w:r>
+          </w:p>
+        </w:tc>
+        <w:tc>
+          <w:tcPr>
+            <w:tcW w:type="dxa" w:w="2835"/>
+            <w:vAlign w:val="center"/>
+          </w:tcPr>
+          <w:p>
+            <w:pPr>
+              <w:spacing w:after="0" w:line="280" w:lineRule="exact"/>
+              <w:ind w:firstLine="0"/>
+              <w:jc w:val="center"/>
+            </w:pPr>
+            <w:r>
+              <w:rPr>
+                <w:rFonts w:ascii="Times New Roman" w:hAnsi="Times New Roman" w:eastAsia="宋体"/>
+                <w:b w:val="0"/>
+                <w:color w:val="000000"/>
+                <w:sz w:val="21"/>
+              </w:rPr>
+              <w:t>2024</w:t>
+            </w:r>
+          </w:p>
+        </w:tc>
+        <w:tc>
+          <w:tcPr>
+            <w:tcW w:type="dxa" w:w="2835"/>
+            <w:vAlign w:val="center"/>
+          </w:tcPr>
+          <w:p>
+            <w:pPr>
+              <w:spacing w:after="0" w:line="280" w:lineRule="exact"/>
+              <w:ind w:firstLine="0"/>
+              <w:jc w:val="center"/>
+            </w:pPr>
+            <w:r>
+              <w:rPr>
+                <w:rFonts w:ascii="Times New Roman" w:hAnsi="Times New Roman" w:eastAsia="宋体"/>
+                <w:b w:val="0"/>
+                <w:color w:val="000000"/>
+                <w:sz w:val="21"/>
+              </w:rPr>
+              <w:t>8.22</w:t>
+            </w:r>
+          </w:p>
+        </w:tc>
+      </w:tr>
+      <w:tr>
+        <w:trPr>
+          <w:cantSplit/>
+        </w:trPr>
+        <w:tc>
+          <w:tcPr>
+            <w:tcW w:type="dxa" w:w="1134"/>
+            <w:vAlign w:val="center"/>
+          </w:tcPr>
+          <w:p>
+            <w:pPr>
+              <w:spacing w:after="0" w:line="280" w:lineRule="exact"/>
+              <w:ind w:firstLine="0"/>
+              <w:jc w:val="center"/>
+            </w:pPr>
+            <w:r>
+              <w:rPr>
+                <w:rFonts w:ascii="Times New Roman" w:hAnsi="Times New Roman" w:eastAsia="宋体"/>
+                <w:b w:val="0"/>
+                <w:color w:val="000000"/>
+                <w:sz w:val="21"/>
+              </w:rPr>
+              <w:t>13</w:t>
+            </w:r>
+          </w:p>
+        </w:tc>
+        <w:tc>
+          <w:tcPr>
+            <w:tcW w:type="dxa" w:w="2268"/>
+            <w:vAlign w:val="center"/>
+          </w:tcPr>
+          <w:p>
+            <w:pPr>
+              <w:spacing w:after="0" w:line="280" w:lineRule="exact"/>
+              <w:ind w:firstLine="0"/>
+              <w:jc w:val="center"/>
+            </w:pPr>
+            <w:r>
+              <w:rPr>
+                <w:rFonts w:ascii="Times New Roman" w:hAnsi="Times New Roman" w:eastAsia="宋体"/>
+                <w:b w:val="0"/>
+                <w:color w:val="000000"/>
+                <w:sz w:val="21"/>
+              </w:rPr>
+              <w:t>+500</w:t>
+            </w:r>
+          </w:p>
+        </w:tc>
+        <w:tc>
+          <w:tcPr>
+            <w:tcW w:type="dxa" w:w="2835"/>
+            <w:vAlign w:val="center"/>
+          </w:tcPr>
+          <w:p>
+            <w:pPr>
+              <w:spacing w:after="0" w:line="280" w:lineRule="exact"/>
+              <w:ind w:firstLine="0"/>
+              <w:jc w:val="center"/>
+            </w:pPr>
+            <w:r>
+              <w:rPr>
+                <w:rFonts w:ascii="Times New Roman" w:hAnsi="Times New Roman" w:eastAsia="宋体"/>
+                <w:b w:val="0"/>
+                <w:color w:val="000000"/>
+                <w:sz w:val="21"/>
+              </w:rPr>
+              <w:t>1563</w:t>
+            </w:r>
+          </w:p>
+        </w:tc>
+        <w:tc>
+          <w:tcPr>
+            <w:tcW w:type="dxa" w:w="2835"/>
+            <w:vAlign w:val="center"/>
+          </w:tcPr>
+          <w:p>
+            <w:pPr>
+              <w:spacing w:after="0" w:line="280" w:lineRule="exact"/>
+              <w:ind w:firstLine="0"/>
+              <w:jc w:val="center"/>
+            </w:pPr>
+            <w:r>
+              <w:rPr>
+                <w:rFonts w:ascii="Times New Roman" w:hAnsi="Times New Roman" w:eastAsia="宋体"/>
+                <w:b w:val="0"/>
+                <w:color w:val="000000"/>
+                <w:sz w:val="21"/>
+              </w:rPr>
+              <w:t>6.44</w:t>
+            </w:r>
+          </w:p>
+        </w:tc>
+      </w:tr>
+      <w:tr>
+        <w:trPr>
+          <w:cantSplit/>
+        </w:trPr>
+        <w:tc>
+          <w:tcPr>
+            <w:tcW w:type="dxa" w:w="1134"/>
+            <w:vAlign w:val="center"/>
+          </w:tcPr>
+          <w:p>
+            <w:pPr>
+              <w:spacing w:after="0" w:line="280" w:lineRule="exact"/>
+              <w:ind w:firstLine="0"/>
+              <w:jc w:val="center"/>
+            </w:pPr>
+            <w:r>
+              <w:rPr>
+                <w:rFonts w:ascii="Times New Roman" w:hAnsi="Times New Roman" w:eastAsia="宋体"/>
+                <w:b w:val="0"/>
+                <w:color w:val="000000"/>
+                <w:sz w:val="21"/>
+              </w:rPr>
+              <w:t>21</w:t>
+            </w:r>
+          </w:p>
+        </w:tc>
+        <w:tc>
+          <w:tcPr>
+            <w:tcW w:type="dxa" w:w="2268"/>
+            <w:vAlign w:val="center"/>
+          </w:tcPr>
+          <w:p>
+            <w:pPr>
+              <w:spacing w:after="0" w:line="280" w:lineRule="exact"/>
+              <w:ind w:firstLine="0"/>
+              <w:jc w:val="center"/>
+            </w:pPr>
+            <w:r>
+              <w:rPr>
+                <w:rFonts w:ascii="Times New Roman" w:hAnsi="Times New Roman" w:eastAsia="宋体"/>
+                <w:b w:val="0"/>
+                <w:color w:val="000000"/>
+                <w:sz w:val="21"/>
+              </w:rPr>
+              <w:t>-1500</w:t>
+            </w:r>
+          </w:p>
+        </w:tc>
+        <w:tc>
+          <w:tcPr>
+            <w:tcW w:type="dxa" w:w="2835"/>
+            <w:vAlign w:val="center"/>
+          </w:tcPr>
+          <w:p>
+            <w:pPr>
+              <w:spacing w:after="0" w:line="280" w:lineRule="exact"/>
+              <w:ind w:firstLine="0"/>
+              <w:jc w:val="center"/>
+            </w:pPr>
+            <w:r>
+              <w:rPr>
+                <w:rFonts w:ascii="Times New Roman" w:hAnsi="Times New Roman" w:eastAsia="宋体"/>
+                <w:b w:val="0"/>
+                <w:color w:val="000000"/>
+                <w:sz w:val="21"/>
+              </w:rPr>
+              <w:t>6099</w:t>
+            </w:r>
+          </w:p>
+        </w:tc>
+        <w:tc>
+          <w:tcPr>
+            <w:tcW w:type="dxa" w:w="2835"/>
+            <w:vAlign w:val="center"/>
+          </w:tcPr>
+          <w:p>
+            <w:pPr>
+              <w:spacing w:after="0" w:line="280" w:lineRule="exact"/>
+              <w:ind w:firstLine="0"/>
+              <w:jc w:val="center"/>
+            </w:pPr>
+            <w:r>
+              <w:rPr>
+                <w:rFonts w:ascii="Times New Roman" w:hAnsi="Times New Roman" w:eastAsia="宋体"/>
+                <w:b w:val="0"/>
+                <w:color w:val="000000"/>
+                <w:sz w:val="21"/>
+              </w:rPr>
+              <w:t>7.19</w:t>
+            </w:r>
+          </w:p>
+        </w:tc>
+      </w:tr>
+      <w:tr>
+        <w:trPr>
+          <w:cantSplit/>
+        </w:trPr>
+        <w:tc>
+          <w:tcPr>
+            <w:tcW w:type="dxa" w:w="1134"/>
+            <w:vAlign w:val="center"/>
+          </w:tcPr>
+          <w:p>
+            <w:pPr>
+              <w:spacing w:after="0" w:line="280" w:lineRule="exact"/>
+              <w:ind w:firstLine="0"/>
+              <w:jc w:val="center"/>
+            </w:pPr>
+            <w:r>
+              <w:rPr>
+                <w:rFonts w:ascii="Times New Roman" w:hAnsi="Times New Roman" w:eastAsia="宋体"/>
+                <w:b w:val="0"/>
+                <w:color w:val="000000"/>
+                <w:sz w:val="21"/>
+              </w:rPr>
+              <w:t>28</w:t>
+            </w:r>
+          </w:p>
+        </w:tc>
+        <w:tc>
+          <w:tcPr>
+            <w:tcW w:type="dxa" w:w="2268"/>
+            <w:vAlign w:val="center"/>
+          </w:tcPr>
+          <w:p>
+            <w:pPr>
+              <w:spacing w:after="0" w:line="280" w:lineRule="exact"/>
+              <w:ind w:firstLine="0"/>
+              <w:jc w:val="center"/>
+            </w:pPr>
+            <w:r>
+              <w:rPr>
+                <w:rFonts w:ascii="Times New Roman" w:hAnsi="Times New Roman" w:eastAsia="宋体"/>
+                <w:b w:val="0"/>
+                <w:color w:val="000000"/>
+                <w:sz w:val="21"/>
+              </w:rPr>
+              <w:t>+500</w:t>
+            </w:r>
+          </w:p>
+        </w:tc>
+        <w:tc>
+          <w:tcPr>
+            <w:tcW w:type="dxa" w:w="2835"/>
+            <w:vAlign w:val="center"/>
+          </w:tcPr>
+          <w:p>
+            <w:pPr>
+              <w:spacing w:after="0" w:line="280" w:lineRule="exact"/>
+              <w:ind w:firstLine="0"/>
+              <w:jc w:val="center"/>
+            </w:pPr>
+            <w:r>
+              <w:rPr>
+                <w:rFonts w:ascii="Times New Roman" w:hAnsi="Times New Roman" w:eastAsia="宋体"/>
+                <w:b w:val="0"/>
+                <w:color w:val="000000"/>
+                <w:sz w:val="21"/>
+              </w:rPr>
+              <w:t>6611</w:t>
+            </w:r>
+          </w:p>
+        </w:tc>
+        <w:tc>
+          <w:tcPr>
+            <w:tcW w:type="dxa" w:w="2835"/>
+            <w:vAlign w:val="center"/>
+          </w:tcPr>
+          <w:p>
+            <w:pPr>
+              <w:spacing w:after="0" w:line="280" w:lineRule="exact"/>
+              <w:ind w:firstLine="0"/>
+              <w:jc w:val="center"/>
+            </w:pPr>
+            <w:r>
+              <w:rPr>
+                <w:rFonts w:ascii="Times New Roman" w:hAnsi="Times New Roman" w:eastAsia="宋体"/>
+                <w:b w:val="0"/>
+                <w:color w:val="000000"/>
+                <w:sz w:val="21"/>
+              </w:rPr>
+              <w:t>5.41</w:t>
+            </w:r>
+          </w:p>
+        </w:tc>
+      </w:tr>
+      <w:tr>
+        <w:trPr>
+          <w:cantSplit/>
+        </w:trPr>
+        <w:tc>
+          <w:tcPr>
+            <w:tcW w:type="dxa" w:w="1134"/>
+            <w:vAlign w:val="center"/>
+          </w:tcPr>
+          <w:p>
+            <w:pPr>
+              <w:spacing w:after="0" w:line="280" w:lineRule="exact"/>
+              <w:ind w:firstLine="0"/>
+              <w:jc w:val="center"/>
+            </w:pPr>
+            <w:r>
+              <w:rPr>
+                <w:rFonts w:ascii="Times New Roman" w:hAnsi="Times New Roman" w:eastAsia="宋体"/>
+                <w:b w:val="0"/>
+                <w:color w:val="000000"/>
+                <w:sz w:val="21"/>
+              </w:rPr>
+              <w:t>39</w:t>
+            </w:r>
+          </w:p>
+        </w:tc>
+        <w:tc>
+          <w:tcPr>
+            <w:tcW w:type="dxa" w:w="2268"/>
+            <w:vAlign w:val="center"/>
+          </w:tcPr>
+          <w:p>
+            <w:pPr>
+              <w:spacing w:after="0" w:line="280" w:lineRule="exact"/>
+              <w:ind w:firstLine="0"/>
+              <w:jc w:val="center"/>
+            </w:pPr>
+            <w:r>
+              <w:rPr>
+                <w:rFonts w:ascii="Times New Roman" w:hAnsi="Times New Roman" w:eastAsia="宋体"/>
+                <w:b w:val="0"/>
+                <w:color w:val="000000"/>
+                <w:sz w:val="21"/>
+              </w:rPr>
+              <w:t>+500</w:t>
+            </w:r>
+          </w:p>
+        </w:tc>
+        <w:tc>
+          <w:tcPr>
+            <w:tcW w:type="dxa" w:w="2835"/>
+            <w:vAlign w:val="center"/>
+          </w:tcPr>
+          <w:p>
+            <w:pPr>
+              <w:spacing w:after="0" w:line="280" w:lineRule="exact"/>
+              <w:ind w:firstLine="0"/>
+              <w:jc w:val="center"/>
+            </w:pPr>
+            <w:r>
+              <w:rPr>
+                <w:rFonts w:ascii="Times New Roman" w:hAnsi="Times New Roman" w:eastAsia="宋体"/>
+                <w:b w:val="0"/>
+                <w:color w:val="000000"/>
+                <w:sz w:val="21"/>
+              </w:rPr>
+              <w:t>13909</w:t>
+            </w:r>
+          </w:p>
+        </w:tc>
+        <w:tc>
+          <w:tcPr>
+            <w:tcW w:type="dxa" w:w="2835"/>
+            <w:vAlign w:val="center"/>
+          </w:tcPr>
+          <w:p>
+            <w:pPr>
+              <w:spacing w:after="0" w:line="280" w:lineRule="exact"/>
+              <w:ind w:firstLine="0"/>
+              <w:jc w:val="center"/>
+            </w:pPr>
+            <w:r>
+              <w:rPr>
+                <w:rFonts w:ascii="Times New Roman" w:hAnsi="Times New Roman" w:eastAsia="宋体"/>
+                <w:b w:val="0"/>
+                <w:color w:val="000000"/>
+                <w:sz w:val="21"/>
+              </w:rPr>
+              <w:t>5.82</w:t>
+            </w:r>
+          </w:p>
+        </w:tc>
+      </w:tr>
+    </w:tbl>
+    <w:p>
+      <w:pPr>
+        <w:spacing w:after="80" w:line="360" w:lineRule="exact" w:before="100"/>
+        <w:ind w:firstLine="482"/>
+        <w:jc w:val="both"/>
+      </w:pPr>
+      <w:r>
+        <w:rPr>
+          <w:rFonts w:ascii="Times New Roman" w:hAnsi="Times New Roman" w:eastAsia="宋体"/>
+          <w:b w:val="0"/>
+          <w:color w:val="000000"/>
+          <w:sz w:val="24"/>
+        </w:rPr>
+        <w:t>软件检出 PRN 8、11、13、21、28、39，六颗卫星的功率峰次峰比均大于 2.5。复核记录显示相关矩阵与保存的软件参考一致，这为相关搜索方法提供了软件层面的对照。</w:t>
+      </w:r>
+    </w:p>
+    <w:p>
+      <w:pPr>
+        <w:spacing w:after="80" w:line="360" w:lineRule="exact"/>
+        <w:ind w:firstLine="482"/>
+        <w:jc w:val="both"/>
+      </w:pPr>
+      <w:r>
+        <w:rPr>
+          <w:rFonts w:ascii="Times New Roman" w:hAnsi="Times New Roman" w:eastAsia="宋体"/>
+          <w:b w:val="0"/>
+          <w:color w:val="000000"/>
+          <w:sz w:val="24"/>
+        </w:rPr>
+        <w:t>软件对照与第 2 节的 RTL 用例使用不同场景和统计量。软件采用相关功率的峰次峰比，原 RTL 采用幅度近似值的峰均比；二者的数值和门限不作直接等同。软件检出六颗卫星也不等同于当前 RTL 已完成完整 100 s 六星接收。</w:t>
+      </w:r>
+    </w:p>
+    <w:p>
+      <w:pPr>
+        <w:pStyle w:val="1"/>
+        <w:pageBreakBefore/>
+      </w:pPr>
+      <w:r>
+        <w:t>4 单星捕获实验过程</w:t>
       </w:r>
     </w:p>
     <w:p>
       <w:pPr>
         <w:pStyle w:val="21"/>
-        <w:rPr>
-          <w:lang w:eastAsia="zh-CN"/>
-        </w:rPr>
+        <w:pageBreakBefore w:val="0"/>
       </w:pPr>
       <w:r>
-        <w:rPr>
-          <w:rFonts w:ascii="Times New Roman" w:eastAsia="黑体" w:hAnsi="Times New Roman"/>
-          <w:lang w:eastAsia="zh-CN"/>
-        </w:rPr>
-        <w:t xml:space="preserve">2.1 捕获过程总览</w:t>
-      </w:r>
-      <w:r>
-        <w:rPr>
-          <w:rFonts w:ascii="Times New Roman" w:eastAsia="黑体" w:hAnsi="Times New Roman"/>
-          <w:lang w:eastAsia="zh-CN"/>
-        </w:rPr>
-        <w:t/>
+        <w:t>4.1 输入与配置</w:t>
       </w:r>
     </w:p>
     <w:tbl>
       <w:tblPr>
-        <w:tblW w:w="9070" w:type="dxa"/>
+        <w:tblW w:type="auto" w:w="0"/>
+        <w:jc w:val="center"/>
         <w:tblLayout w:type="fixed"/>
+        <w:tblLook w:firstColumn="1" w:firstRow="1" w:lastColumn="0" w:lastRow="0" w:noHBand="0" w:noVBand="1" w:val="04A0"/>
+        <w:tblBorders>
+          <w:top w:val="single" w:sz="4" w:color="D9D9D9"/>
+          <w:left w:val="single" w:sz="4" w:color="D9D9D9"/>
+          <w:bottom w:val="single" w:sz="4" w:color="D9D9D9"/>
+          <w:right w:val="single" w:sz="4" w:color="D9D9D9"/>
+          <w:insideH w:val="single" w:sz="4" w:color="D9D9D9"/>
+          <w:insideV w:val="single" w:sz="4" w:color="D9D9D9"/>
+        </w:tblBorders>
+        <w:tblCellMar>
+          <w:top w:w="75" w:type="dxa"/>
+          <w:bottom w:w="75" w:type="dxa"/>
+          <w:left w:w="100" w:type="dxa"/>
+          <w:right w:w="100" w:type="dxa"/>
+        </w:tblCellMar>
+      </w:tblPr>
+      <w:tblGrid>
+        <w:gridCol w:w="2154"/>
+        <w:gridCol w:w="6917"/>
+      </w:tblGrid>
+      <w:tr>
+        <w:trPr>
+          <w:cantSplit/>
+          <w:tblHeader/>
+        </w:trPr>
+        <w:tc>
+          <w:tcPr>
+            <w:tcW w:type="dxa" w:w="2154"/>
+            <w:vAlign w:val="center"/>
+            <w:shd w:fill="F2F2F2"/>
+          </w:tcPr>
+          <w:p>
+            <w:pPr>
+              <w:spacing w:after="0" w:line="280" w:lineRule="exact"/>
+              <w:ind w:firstLine="0"/>
+              <w:jc w:val="center"/>
+            </w:pPr>
+            <w:r>
+              <w:rPr>
+                <w:rFonts w:ascii="Times New Roman" w:hAnsi="Times New Roman" w:eastAsia="宋体"/>
+                <w:b/>
+                <w:color w:val="000000"/>
+                <w:sz w:val="21"/>
+              </w:rPr>
+              <w:t>项目</w:t>
+            </w:r>
+          </w:p>
+        </w:tc>
+        <w:tc>
+          <w:tcPr>
+            <w:tcW w:type="dxa" w:w="6917"/>
+            <w:vAlign w:val="center"/>
+            <w:shd w:fill="F2F2F2"/>
+          </w:tcPr>
+          <w:p>
+            <w:pPr>
+              <w:spacing w:after="0" w:line="280" w:lineRule="exact"/>
+              <w:ind w:firstLine="0"/>
+              <w:jc w:val="center"/>
+            </w:pPr>
+            <w:r>
+              <w:rPr>
+                <w:rFonts w:ascii="Times New Roman" w:hAnsi="Times New Roman" w:eastAsia="宋体"/>
+                <w:b/>
+                <w:color w:val="000000"/>
+                <w:sz w:val="21"/>
+              </w:rPr>
+              <w:t>本次单星实验配置</w:t>
+            </w:r>
+          </w:p>
+        </w:tc>
+      </w:tr>
+      <w:tr>
+        <w:trPr>
+          <w:cantSplit/>
+        </w:trPr>
+        <w:tc>
+          <w:tcPr>
+            <w:tcW w:type="dxa" w:w="2154"/>
+            <w:vAlign w:val="center"/>
+          </w:tcPr>
+          <w:p>
+            <w:pPr>
+              <w:spacing w:after="0" w:line="280" w:lineRule="exact"/>
+              <w:ind w:firstLine="0"/>
+              <w:jc w:val="left"/>
+            </w:pPr>
+            <w:r>
+              <w:rPr>
+                <w:rFonts w:ascii="Times New Roman" w:hAnsi="Times New Roman" w:eastAsia="宋体"/>
+                <w:b w:val="0"/>
+                <w:color w:val="000000"/>
+                <w:sz w:val="21"/>
+              </w:rPr>
+              <w:t>信号来源</w:t>
+            </w:r>
+          </w:p>
+        </w:tc>
+        <w:tc>
+          <w:tcPr>
+            <w:tcW w:type="dxa" w:w="6917"/>
+            <w:vAlign w:val="center"/>
+          </w:tcPr>
+          <w:p>
+            <w:pPr>
+              <w:spacing w:after="0" w:line="280" w:lineRule="exact"/>
+              <w:ind w:firstLine="0"/>
+              <w:jc w:val="left"/>
+            </w:pPr>
+            <w:r>
+              <w:rPr>
+                <w:rFonts w:ascii="Times New Roman" w:hAnsi="Times New Roman" w:eastAsia="宋体"/>
+                <w:b w:val="0"/>
+                <w:color w:val="000000"/>
+                <w:sz w:val="21"/>
+              </w:rPr>
+              <w:t>教师 bdi_signal_source；PRN 6；信号起始位置 10</w:t>
+            </w:r>
+          </w:p>
+        </w:tc>
+      </w:tr>
+      <w:tr>
+        <w:trPr>
+          <w:cantSplit/>
+        </w:trPr>
+        <w:tc>
+          <w:tcPr>
+            <w:tcW w:type="dxa" w:w="2154"/>
+            <w:vAlign w:val="center"/>
+          </w:tcPr>
+          <w:p>
+            <w:pPr>
+              <w:spacing w:after="0" w:line="280" w:lineRule="exact"/>
+              <w:ind w:firstLine="0"/>
+              <w:jc w:val="left"/>
+            </w:pPr>
+            <w:r>
+              <w:rPr>
+                <w:rFonts w:ascii="Times New Roman" w:hAnsi="Times New Roman" w:eastAsia="宋体"/>
+                <w:b w:val="0"/>
+                <w:color w:val="000000"/>
+                <w:sz w:val="21"/>
+              </w:rPr>
+              <w:t>输入与采样</w:t>
+            </w:r>
+          </w:p>
+        </w:tc>
+        <w:tc>
+          <w:tcPr>
+            <w:tcW w:type="dxa" w:w="6917"/>
+            <w:vAlign w:val="center"/>
+          </w:tcPr>
+          <w:p>
+            <w:pPr>
+              <w:spacing w:after="0" w:line="280" w:lineRule="exact"/>
+              <w:ind w:firstLine="0"/>
+              <w:jc w:val="left"/>
+            </w:pPr>
+            <w:r>
+              <w:rPr>
+                <w:rFonts w:ascii="Times New Roman" w:hAnsi="Times New Roman" w:eastAsia="宋体"/>
+                <w:b w:val="0"/>
+                <w:color w:val="000000"/>
+                <w:sz w:val="21"/>
+              </w:rPr>
+              <w:t>有符号 2 位样本；16.368 MHz；每码片 8 个样本</w:t>
+            </w:r>
+          </w:p>
+        </w:tc>
+      </w:tr>
+      <w:tr>
+        <w:trPr>
+          <w:cantSplit/>
+        </w:trPr>
+        <w:tc>
+          <w:tcPr>
+            <w:tcW w:type="dxa" w:w="2154"/>
+            <w:vAlign w:val="center"/>
+          </w:tcPr>
+          <w:p>
+            <w:pPr>
+              <w:spacing w:after="0" w:line="280" w:lineRule="exact"/>
+              <w:ind w:firstLine="0"/>
+              <w:jc w:val="left"/>
+            </w:pPr>
+            <w:r>
+              <w:rPr>
+                <w:rFonts w:ascii="Times New Roman" w:hAnsi="Times New Roman" w:eastAsia="宋体"/>
+                <w:b w:val="0"/>
+                <w:color w:val="000000"/>
+                <w:sz w:val="21"/>
+              </w:rPr>
+              <w:t>载波与噪声</w:t>
+            </w:r>
+          </w:p>
+        </w:tc>
+        <w:tc>
+          <w:tcPr>
+            <w:tcW w:type="dxa" w:w="6917"/>
+            <w:vAlign w:val="center"/>
+          </w:tcPr>
+          <w:p>
+            <w:pPr>
+              <w:spacing w:after="0" w:line="280" w:lineRule="exact"/>
+              <w:ind w:firstLine="0"/>
+              <w:jc w:val="left"/>
+            </w:pPr>
+            <w:r>
+              <w:rPr>
+                <w:rFonts w:ascii="Times New Roman" w:hAnsi="Times New Roman" w:eastAsia="宋体"/>
+                <w:b w:val="0"/>
+                <w:color w:val="000000"/>
+                <w:sz w:val="21"/>
+              </w:rPr>
+              <w:t>中频 4.092 MHz；多普勒 0；未叠加噪声</w:t>
+            </w:r>
+          </w:p>
+        </w:tc>
+      </w:tr>
+      <w:tr>
+        <w:trPr>
+          <w:cantSplit/>
+        </w:trPr>
+        <w:tc>
+          <w:tcPr>
+            <w:tcW w:type="dxa" w:w="2154"/>
+            <w:vAlign w:val="center"/>
+          </w:tcPr>
+          <w:p>
+            <w:pPr>
+              <w:spacing w:after="0" w:line="280" w:lineRule="exact"/>
+              <w:ind w:firstLine="0"/>
+              <w:jc w:val="left"/>
+            </w:pPr>
+            <w:r>
+              <w:rPr>
+                <w:rFonts w:ascii="Times New Roman" w:hAnsi="Times New Roman" w:eastAsia="宋体"/>
+                <w:b w:val="0"/>
+                <w:color w:val="000000"/>
+                <w:sz w:val="21"/>
+              </w:rPr>
+              <w:t>窗口长度</w:t>
+            </w:r>
+          </w:p>
+        </w:tc>
+        <w:tc>
+          <w:tcPr>
+            <w:tcW w:type="dxa" w:w="6917"/>
+            <w:vAlign w:val="center"/>
+          </w:tcPr>
+          <w:p>
+            <w:pPr>
+              <w:spacing w:after="0" w:line="280" w:lineRule="exact"/>
+              <w:ind w:firstLine="0"/>
+              <w:jc w:val="left"/>
+            </w:pPr>
+            <w:r>
+              <w:rPr>
+                <w:rFonts w:ascii="Times New Roman" w:hAnsi="Times New Roman" w:eastAsia="宋体"/>
+                <w:b w:val="0"/>
+                <w:color w:val="000000"/>
+                <w:sz w:val="21"/>
+              </w:rPr>
+              <w:t>16368 个有效样本，约 1 ms</w:t>
+            </w:r>
+          </w:p>
+        </w:tc>
+      </w:tr>
+      <w:tr>
+        <w:trPr>
+          <w:cantSplit/>
+        </w:trPr>
+        <w:tc>
+          <w:tcPr>
+            <w:tcW w:type="dxa" w:w="2154"/>
+            <w:vAlign w:val="center"/>
+          </w:tcPr>
+          <w:p>
+            <w:pPr>
+              <w:spacing w:after="0" w:line="280" w:lineRule="exact"/>
+              <w:ind w:firstLine="0"/>
+              <w:jc w:val="left"/>
+            </w:pPr>
+            <w:r>
+              <w:rPr>
+                <w:rFonts w:ascii="Times New Roman" w:hAnsi="Times New Roman" w:eastAsia="宋体"/>
+                <w:b w:val="0"/>
+                <w:color w:val="000000"/>
+                <w:sz w:val="21"/>
+              </w:rPr>
+              <w:t>搜索与门限</w:t>
+            </w:r>
+          </w:p>
+        </w:tc>
+        <w:tc>
+          <w:tcPr>
+            <w:tcW w:type="dxa" w:w="6917"/>
+            <w:vAlign w:val="center"/>
+          </w:tcPr>
+          <w:p>
+            <w:pPr>
+              <w:spacing w:after="0" w:line="280" w:lineRule="exact"/>
+              <w:ind w:firstLine="0"/>
+              <w:jc w:val="left"/>
+            </w:pPr>
+            <w:r>
+              <w:rPr>
+                <w:rFonts w:ascii="Times New Roman" w:hAnsi="Times New Roman" w:eastAsia="宋体"/>
+                <w:b w:val="0"/>
+                <w:color w:val="000000"/>
+                <w:sz w:val="21"/>
+              </w:rPr>
+              <w:t>初始位置 0；失败后每轮增加 1；能量门限 67 108 864</w:t>
+            </w:r>
+          </w:p>
+        </w:tc>
+      </w:tr>
+      <w:tr>
+        <w:trPr>
+          <w:cantSplit/>
+        </w:trPr>
+        <w:tc>
+          <w:tcPr>
+            <w:tcW w:type="dxa" w:w="2154"/>
+            <w:vAlign w:val="center"/>
+          </w:tcPr>
+          <w:p>
+            <w:pPr>
+              <w:spacing w:after="0" w:line="280" w:lineRule="exact"/>
+              <w:ind w:firstLine="0"/>
+              <w:jc w:val="left"/>
+            </w:pPr>
+            <w:r>
+              <w:rPr>
+                <w:rFonts w:ascii="Times New Roman" w:hAnsi="Times New Roman" w:eastAsia="宋体"/>
+                <w:b w:val="0"/>
+                <w:color w:val="000000"/>
+                <w:sz w:val="21"/>
+              </w:rPr>
+              <w:t>结束安排</w:t>
+            </w:r>
+          </w:p>
+        </w:tc>
+        <w:tc>
+          <w:tcPr>
+            <w:tcW w:type="dxa" w:w="6917"/>
+            <w:vAlign w:val="center"/>
+          </w:tcPr>
+          <w:p>
+            <w:pPr>
+              <w:spacing w:after="0" w:line="280" w:lineRule="exact"/>
+              <w:ind w:firstLine="0"/>
+              <w:jc w:val="left"/>
+            </w:pPr>
+            <w:r>
+              <w:rPr>
+                <w:rFonts w:ascii="Times New Roman" w:hAnsi="Times New Roman" w:eastAsia="宋体"/>
+                <w:b w:val="0"/>
+                <w:color w:val="000000"/>
+                <w:sz w:val="21"/>
+              </w:rPr>
+              <w:t>第 11 轮捕获后再计算两轮；共 212 784 个有效样本</w:t>
+            </w:r>
+          </w:p>
+        </w:tc>
+      </w:tr>
+    </w:tbl>
+    <w:p>
+      <w:pPr>
+        <w:pStyle w:val="21"/>
+        <w:pageBreakBefore w:val="0"/>
+      </w:pPr>
+      <w:r>
+        <w:t>4.2 仿真步骤</w:t>
+      </w:r>
+    </w:p>
+    <w:p>
+      <w:pPr>
+        <w:spacing w:after="80" w:line="360" w:lineRule="exact"/>
+        <w:ind w:firstLine="482"/>
+        <w:jc w:val="both"/>
+      </w:pPr>
+      <w:r>
+        <w:rPr>
+          <w:rFonts w:ascii="Times New Roman" w:hAnsi="Times New Roman" w:eastAsia="宋体"/>
+          <w:b w:val="0"/>
+          <w:color w:val="000000"/>
+          <w:sz w:val="24"/>
+        </w:rPr>
+        <w:t>先复位，再发出一个时钟周期的 start。本地码表完成装载、ready 置位后启动教师信号源。</w:t>
+      </w:r>
+    </w:p>
+    <w:p>
+      <w:pPr>
+        <w:spacing w:after="80" w:line="360" w:lineRule="exact"/>
+        <w:ind w:firstLine="482"/>
+        <w:jc w:val="both"/>
+      </w:pPr>
+      <w:r>
+        <w:rPr>
+          <w:rFonts w:ascii="Times New Roman" w:hAnsi="Times New Roman" w:eastAsia="宋体"/>
+          <w:b w:val="0"/>
+          <w:color w:val="000000"/>
+          <w:sz w:val="24"/>
+        </w:rPr>
+        <w:t>从本地起始位置 0 开始，每轮输入 16368 个有效样本，计算两路累加值与能量。未达到门限时转到下一位置。</w:t>
+      </w:r>
+    </w:p>
+    <w:p>
+      <w:pPr>
+        <w:spacing w:after="80" w:line="360" w:lineRule="exact"/>
+        <w:ind w:firstLine="482"/>
+        <w:jc w:val="both"/>
+      </w:pPr>
+      <w:r>
+        <w:rPr>
+          <w:rFonts w:ascii="Times New Roman" w:hAnsi="Times New Roman" w:eastAsia="宋体"/>
+          <w:b w:val="0"/>
+          <w:color w:val="000000"/>
+          <w:sz w:val="24"/>
+        </w:rPr>
+        <w:t>每次 dump 记录刚完成的窗口编号、起始位置、I、Q、energy 和 capture，并检查累计有效样本数。</w:t>
+      </w:r>
+    </w:p>
+    <w:p>
+      <w:pPr>
+        <w:spacing w:after="80" w:line="360" w:lineRule="exact"/>
+        <w:ind w:firstLine="482"/>
+        <w:jc w:val="both"/>
+      </w:pPr>
+      <w:r>
+        <w:rPr>
+          <w:rFonts w:ascii="Times New Roman" w:hAnsi="Times New Roman" w:eastAsia="宋体"/>
+          <w:b w:val="0"/>
+          <w:color w:val="000000"/>
+          <w:sz w:val="24"/>
+        </w:rPr>
+        <w:t>首次捕获后保持该位置，继续处理两个完整窗口，比较信号码与本地码是否逐样本一致。</w:t>
+      </w:r>
+    </w:p>
+    <w:p>
+      <w:pPr>
+        <w:spacing w:after="80" w:line="360" w:lineRule="exact"/>
+        <w:ind w:firstLine="482"/>
+        <w:jc w:val="both"/>
+      </w:pPr>
+      <w:r>
+        <w:rPr>
+          <w:rFonts w:ascii="Times New Roman" w:hAnsi="Times New Roman" w:eastAsia="宋体"/>
+          <w:b w:val="0"/>
+          <w:color w:val="000000"/>
+          <w:sz w:val="24"/>
+        </w:rPr>
+        <w:t>脚本检查 13 轮结果以及能量比要求，保存 CSV、结果 JSON 和实际 ModelSim 波形文件。</w:t>
+      </w:r>
+    </w:p>
+    <w:p>
+      <w:pPr>
+        <w:pStyle w:val="21"/>
+        <w:pageBreakBefore w:val="0"/>
+      </w:pPr>
+      <w:r>
+        <w:t>4.3 复现命令</w:t>
+      </w:r>
+    </w:p>
+    <w:p>
+      <w:pPr>
+        <w:spacing w:after="80" w:line="300" w:lineRule="exact"/>
+        <w:ind w:firstLine="0"/>
+        <w:jc w:val="both"/>
+      </w:pPr>
+      <w:r>
+        <w:rPr>
+          <w:rFonts w:ascii="Times New Roman" w:hAnsi="Times New Roman" w:eastAsia="宋体"/>
+          <w:b w:val="0"/>
+          <w:color w:val="000000"/>
+          <w:sz w:val="22"/>
+        </w:rPr>
+        <w:t>双击项目根目录“单星捕获验收”中的“打开验收波形.cmd”，可重新仿真并打开六个主要观测信号。只运行并核对数据时，在项目根目录执行：</w:t>
+      </w:r>
+    </w:p>
+    <w:p>
+      <w:pPr>
+        <w:spacing w:after="80" w:line="300" w:lineRule="exact"/>
+        <w:ind w:firstLine="0"/>
+        <w:jc w:val="left"/>
+      </w:pPr>
+      <w:r>
+        <w:rPr>
+          <w:rFonts w:ascii="Times New Roman" w:hAnsi="Times New Roman" w:eastAsia="宋体"/>
+          <w:b w:val="0"/>
+          <w:color w:val="000000"/>
+          <w:sz w:val="19"/>
+        </w:rPr>
+        <w:t>powershell.exe -NoProfile -ExecutionPolicy Bypass -File .\单星捕获验收\run_demo.ps1 -NoGui</w:t>
+      </w:r>
+    </w:p>
+    <w:p>
+      <w:pPr>
+        <w:spacing w:after="80" w:line="300" w:lineRule="exact"/>
+        <w:ind w:firstLine="0"/>
+        <w:jc w:val="both"/>
+      </w:pPr>
+      <w:r>
+        <w:rPr>
+          <w:rFonts w:ascii="Times New Roman" w:hAnsi="Times New Roman" w:eastAsia="宋体"/>
+          <w:b w:val="0"/>
+          <w:color w:val="000000"/>
+          <w:sz w:val="22"/>
+        </w:rPr>
+        <w:t>波形时钟按约 16.368 MHz 设置；窗口完整性以有效样本计数为准。波形总时间包含本地码表准备阶段，因此第 11 个相关窗口结束不严格位于绝对仿真时间 11 ms。</w:t>
+      </w:r>
+    </w:p>
+    <w:p>
+      <w:pPr>
+        <w:pStyle w:val="1"/>
+        <w:pageBreakBefore/>
+      </w:pPr>
+      <w:r>
+        <w:t>5 单星逐轮结果与能量分析</w:t>
+      </w:r>
+    </w:p>
+    <w:tbl>
+      <w:tblPr>
+        <w:tblW w:type="auto" w:w="0"/>
+        <w:jc w:val="center"/>
+        <w:tblLayout w:type="fixed"/>
+        <w:tblLook w:firstColumn="1" w:firstRow="1" w:lastColumn="0" w:lastRow="0" w:noHBand="0" w:noVBand="1" w:val="04A0"/>
+        <w:tblBorders>
+          <w:top w:val="single" w:sz="4" w:color="D9D9D9"/>
+          <w:left w:val="single" w:sz="4" w:color="D9D9D9"/>
+          <w:bottom w:val="single" w:sz="4" w:color="D9D9D9"/>
+          <w:right w:val="single" w:sz="4" w:color="D9D9D9"/>
+          <w:insideH w:val="single" w:sz="4" w:color="D9D9D9"/>
+          <w:insideV w:val="single" w:sz="4" w:color="D9D9D9"/>
+        </w:tblBorders>
+        <w:tblCellMar>
+          <w:top w:w="75" w:type="dxa"/>
+          <w:bottom w:w="75" w:type="dxa"/>
+          <w:left w:w="100" w:type="dxa"/>
+          <w:right w:w="100" w:type="dxa"/>
+        </w:tblCellMar>
+      </w:tblPr>
+      <w:tblGrid>
+        <w:gridCol w:w="850"/>
+        <w:gridCol w:w="1134"/>
+        <w:gridCol w:w="1814"/>
+        <w:gridCol w:w="3685"/>
+        <w:gridCol w:w="1587"/>
+      </w:tblGrid>
+      <w:tr>
+        <w:trPr>
+          <w:cantSplit/>
+          <w:tblHeader/>
+        </w:trPr>
+        <w:tc>
+          <w:tcPr>
+            <w:tcW w:type="dxa" w:w="850"/>
+            <w:vAlign w:val="center"/>
+            <w:shd w:fill="F2F2F2"/>
+          </w:tcPr>
+          <w:p>
+            <w:pPr>
+              <w:spacing w:after="0" w:line="280" w:lineRule="exact"/>
+              <w:ind w:firstLine="0"/>
+              <w:jc w:val="center"/>
+            </w:pPr>
+            <w:r>
+              <w:rPr>
+                <w:rFonts w:ascii="Times New Roman" w:hAnsi="Times New Roman" w:eastAsia="宋体"/>
+                <w:b/>
+                <w:color w:val="000000"/>
+                <w:sz w:val="21"/>
+              </w:rPr>
+              <w:t>窗口</w:t>
+            </w:r>
+          </w:p>
+        </w:tc>
+        <w:tc>
+          <w:tcPr>
+            <w:tcW w:type="dxa" w:w="1134"/>
+            <w:vAlign w:val="center"/>
+            <w:shd w:fill="F2F2F2"/>
+          </w:tcPr>
+          <w:p>
+            <w:pPr>
+              <w:spacing w:after="0" w:line="280" w:lineRule="exact"/>
+              <w:ind w:firstLine="0"/>
+              <w:jc w:val="center"/>
+            </w:pPr>
+            <w:r>
+              <w:rPr>
+                <w:rFonts w:ascii="Times New Roman" w:hAnsi="Times New Roman" w:eastAsia="宋体"/>
+                <w:b/>
+                <w:color w:val="000000"/>
+                <w:sz w:val="21"/>
+              </w:rPr>
+              <w:t>起始位置</w:t>
+            </w:r>
+          </w:p>
+        </w:tc>
+        <w:tc>
+          <w:tcPr>
+            <w:tcW w:type="dxa" w:w="1814"/>
+            <w:vAlign w:val="center"/>
+            <w:shd w:fill="F2F2F2"/>
+          </w:tcPr>
+          <w:p>
+            <w:pPr>
+              <w:spacing w:after="0" w:line="280" w:lineRule="exact"/>
+              <w:ind w:firstLine="0"/>
+              <w:jc w:val="center"/>
+            </w:pPr>
+            <w:r>
+              <w:rPr>
+                <w:rFonts w:ascii="Times New Roman" w:hAnsi="Times New Roman" w:eastAsia="宋体"/>
+                <w:b/>
+                <w:color w:val="000000"/>
+                <w:sz w:val="21"/>
+              </w:rPr>
+              <w:t>Q 累加值</w:t>
+            </w:r>
+          </w:p>
+        </w:tc>
+        <w:tc>
+          <w:tcPr>
+            <w:tcW w:type="dxa" w:w="3685"/>
+            <w:vAlign w:val="center"/>
+            <w:shd w:fill="F2F2F2"/>
+          </w:tcPr>
+          <w:p>
+            <w:pPr>
+              <w:spacing w:after="0" w:line="280" w:lineRule="exact"/>
+              <w:ind w:firstLine="0"/>
+              <w:jc w:val="center"/>
+            </w:pPr>
+            <w:r>
+              <w:rPr>
+                <w:rFonts w:ascii="Times New Roman" w:hAnsi="Times New Roman" w:eastAsia="宋体"/>
+                <w:b/>
+                <w:color w:val="000000"/>
+                <w:sz w:val="21"/>
+              </w:rPr>
+              <w:t>相关能量 E</w:t>
+            </w:r>
+          </w:p>
+        </w:tc>
+        <w:tc>
+          <w:tcPr>
+            <w:tcW w:type="dxa" w:w="1587"/>
+            <w:vAlign w:val="center"/>
+            <w:shd w:fill="F2F2F2"/>
+          </w:tcPr>
+          <w:p>
+            <w:pPr>
+              <w:spacing w:after="0" w:line="280" w:lineRule="exact"/>
+              <w:ind w:firstLine="0"/>
+              <w:jc w:val="center"/>
+            </w:pPr>
+            <w:r>
+              <w:rPr>
+                <w:rFonts w:ascii="Times New Roman" w:hAnsi="Times New Roman" w:eastAsia="宋体"/>
+                <w:b/>
+                <w:color w:val="000000"/>
+                <w:sz w:val="21"/>
+              </w:rPr>
+              <w:t>capture</w:t>
+            </w:r>
+          </w:p>
+        </w:tc>
+      </w:tr>
+      <w:tr>
+        <w:trPr>
+          <w:cantSplit/>
+        </w:trPr>
+        <w:tc>
+          <w:tcPr>
+            <w:tcW w:type="dxa" w:w="850"/>
+            <w:vAlign w:val="center"/>
+          </w:tcPr>
+          <w:p>
+            <w:pPr>
+              <w:spacing w:after="0" w:line="280" w:lineRule="exact"/>
+              <w:ind w:firstLine="0"/>
+              <w:jc w:val="center"/>
+            </w:pPr>
+            <w:r>
+              <w:rPr>
+                <w:rFonts w:ascii="Times New Roman" w:hAnsi="Times New Roman" w:eastAsia="宋体"/>
+                <w:b w:val="0"/>
+                <w:color w:val="000000"/>
+                <w:sz w:val="21"/>
+              </w:rPr>
+              <w:t>1</w:t>
+            </w:r>
+          </w:p>
+        </w:tc>
+        <w:tc>
+          <w:tcPr>
+            <w:tcW w:type="dxa" w:w="1134"/>
+            <w:vAlign w:val="center"/>
+          </w:tcPr>
+          <w:p>
+            <w:pPr>
+              <w:spacing w:after="0" w:line="280" w:lineRule="exact"/>
+              <w:ind w:firstLine="0"/>
+              <w:jc w:val="center"/>
+            </w:pPr>
+            <w:r>
+              <w:rPr>
+                <w:rFonts w:ascii="Times New Roman" w:hAnsi="Times New Roman" w:eastAsia="宋体"/>
+                <w:b w:val="0"/>
+                <w:color w:val="000000"/>
+                <w:sz w:val="21"/>
+              </w:rPr>
+              <w:t>0</w:t>
+            </w:r>
+          </w:p>
+        </w:tc>
+        <w:tc>
+          <w:tcPr>
+            <w:tcW w:type="dxa" w:w="1814"/>
+            <w:vAlign w:val="center"/>
+          </w:tcPr>
+          <w:p>
+            <w:pPr>
+              <w:spacing w:after="0" w:line="280" w:lineRule="exact"/>
+              <w:ind w:firstLine="0"/>
+              <w:jc w:val="center"/>
+            </w:pPr>
+            <w:r>
+              <w:rPr>
+                <w:rFonts w:ascii="Times New Roman" w:hAnsi="Times New Roman" w:eastAsia="宋体"/>
+                <w:b w:val="0"/>
+                <w:color w:val="000000"/>
+                <w:sz w:val="21"/>
+              </w:rPr>
+              <w:t>-1,624</w:t>
+            </w:r>
+          </w:p>
+        </w:tc>
+        <w:tc>
+          <w:tcPr>
+            <w:tcW w:type="dxa" w:w="3685"/>
+            <w:vAlign w:val="center"/>
+          </w:tcPr>
+          <w:p>
+            <w:pPr>
+              <w:spacing w:after="0" w:line="280" w:lineRule="exact"/>
+              <w:ind w:firstLine="0"/>
+              <w:jc w:val="center"/>
+            </w:pPr>
+            <w:r>
+              <w:rPr>
+                <w:rFonts w:ascii="Times New Roman" w:hAnsi="Times New Roman" w:eastAsia="宋体"/>
+                <w:b w:val="0"/>
+                <w:color w:val="000000"/>
+                <w:sz w:val="21"/>
+              </w:rPr>
+              <w:t>2,637,376</w:t>
+            </w:r>
+          </w:p>
+        </w:tc>
+        <w:tc>
+          <w:tcPr>
+            <w:tcW w:type="dxa" w:w="1587"/>
+            <w:vAlign w:val="center"/>
+          </w:tcPr>
+          <w:p>
+            <w:pPr>
+              <w:spacing w:after="0" w:line="280" w:lineRule="exact"/>
+              <w:ind w:firstLine="0"/>
+              <w:jc w:val="center"/>
+            </w:pPr>
+            <w:r>
+              <w:rPr>
+                <w:rFonts w:ascii="Times New Roman" w:hAnsi="Times New Roman" w:eastAsia="宋体"/>
+                <w:b w:val="0"/>
+                <w:color w:val="000000"/>
+                <w:sz w:val="21"/>
+              </w:rPr>
+              <w:t>0</w:t>
+            </w:r>
+          </w:p>
+        </w:tc>
+      </w:tr>
+      <w:tr>
+        <w:trPr>
+          <w:cantSplit/>
+        </w:trPr>
+        <w:tc>
+          <w:tcPr>
+            <w:tcW w:type="dxa" w:w="850"/>
+            <w:vAlign w:val="center"/>
+          </w:tcPr>
+          <w:p>
+            <w:pPr>
+              <w:spacing w:after="0" w:line="280" w:lineRule="exact"/>
+              <w:ind w:firstLine="0"/>
+              <w:jc w:val="center"/>
+            </w:pPr>
+            <w:r>
+              <w:rPr>
+                <w:rFonts w:ascii="Times New Roman" w:hAnsi="Times New Roman" w:eastAsia="宋体"/>
+                <w:b w:val="0"/>
+                <w:color w:val="000000"/>
+                <w:sz w:val="21"/>
+              </w:rPr>
+              <w:t>2</w:t>
+            </w:r>
+          </w:p>
+        </w:tc>
+        <w:tc>
+          <w:tcPr>
+            <w:tcW w:type="dxa" w:w="1134"/>
+            <w:vAlign w:val="center"/>
+          </w:tcPr>
+          <w:p>
+            <w:pPr>
+              <w:spacing w:after="0" w:line="280" w:lineRule="exact"/>
+              <w:ind w:firstLine="0"/>
+              <w:jc w:val="center"/>
+            </w:pPr>
+            <w:r>
+              <w:rPr>
+                <w:rFonts w:ascii="Times New Roman" w:hAnsi="Times New Roman" w:eastAsia="宋体"/>
+                <w:b w:val="0"/>
+                <w:color w:val="000000"/>
+                <w:sz w:val="21"/>
+              </w:rPr>
+              <w:t>1</w:t>
+            </w:r>
+          </w:p>
+        </w:tc>
+        <w:tc>
+          <w:tcPr>
+            <w:tcW w:type="dxa" w:w="1814"/>
+            <w:vAlign w:val="center"/>
+          </w:tcPr>
+          <w:p>
+            <w:pPr>
+              <w:spacing w:after="0" w:line="280" w:lineRule="exact"/>
+              <w:ind w:firstLine="0"/>
+              <w:jc w:val="center"/>
+            </w:pPr>
+            <w:r>
+              <w:rPr>
+                <w:rFonts w:ascii="Times New Roman" w:hAnsi="Times New Roman" w:eastAsia="宋体"/>
+                <w:b w:val="0"/>
+                <w:color w:val="000000"/>
+                <w:sz w:val="21"/>
+              </w:rPr>
+              <w:t>-56</w:t>
+            </w:r>
+          </w:p>
+        </w:tc>
+        <w:tc>
+          <w:tcPr>
+            <w:tcW w:type="dxa" w:w="3685"/>
+            <w:vAlign w:val="center"/>
+          </w:tcPr>
+          <w:p>
+            <w:pPr>
+              <w:spacing w:after="0" w:line="280" w:lineRule="exact"/>
+              <w:ind w:firstLine="0"/>
+              <w:jc w:val="center"/>
+            </w:pPr>
+            <w:r>
+              <w:rPr>
+                <w:rFonts w:ascii="Times New Roman" w:hAnsi="Times New Roman" w:eastAsia="宋体"/>
+                <w:b w:val="0"/>
+                <w:color w:val="000000"/>
+                <w:sz w:val="21"/>
+              </w:rPr>
+              <w:t>3,136</w:t>
+            </w:r>
+          </w:p>
+        </w:tc>
+        <w:tc>
+          <w:tcPr>
+            <w:tcW w:type="dxa" w:w="1587"/>
+            <w:vAlign w:val="center"/>
+          </w:tcPr>
+          <w:p>
+            <w:pPr>
+              <w:spacing w:after="0" w:line="280" w:lineRule="exact"/>
+              <w:ind w:firstLine="0"/>
+              <w:jc w:val="center"/>
+            </w:pPr>
+            <w:r>
+              <w:rPr>
+                <w:rFonts w:ascii="Times New Roman" w:hAnsi="Times New Roman" w:eastAsia="宋体"/>
+                <w:b w:val="0"/>
+                <w:color w:val="000000"/>
+                <w:sz w:val="21"/>
+              </w:rPr>
+              <w:t>0</w:t>
+            </w:r>
+          </w:p>
+        </w:tc>
+      </w:tr>
+      <w:tr>
+        <w:trPr>
+          <w:cantSplit/>
+        </w:trPr>
+        <w:tc>
+          <w:tcPr>
+            <w:tcW w:type="dxa" w:w="850"/>
+            <w:vAlign w:val="center"/>
+          </w:tcPr>
+          <w:p>
+            <w:pPr>
+              <w:spacing w:after="0" w:line="280" w:lineRule="exact"/>
+              <w:ind w:firstLine="0"/>
+              <w:jc w:val="center"/>
+            </w:pPr>
+            <w:r>
+              <w:rPr>
+                <w:rFonts w:ascii="Times New Roman" w:hAnsi="Times New Roman" w:eastAsia="宋体"/>
+                <w:b w:val="0"/>
+                <w:color w:val="000000"/>
+                <w:sz w:val="21"/>
+              </w:rPr>
+              <w:t>3</w:t>
+            </w:r>
+          </w:p>
+        </w:tc>
+        <w:tc>
+          <w:tcPr>
+            <w:tcW w:type="dxa" w:w="1134"/>
+            <w:vAlign w:val="center"/>
+          </w:tcPr>
+          <w:p>
+            <w:pPr>
+              <w:spacing w:after="0" w:line="280" w:lineRule="exact"/>
+              <w:ind w:firstLine="0"/>
+              <w:jc w:val="center"/>
+            </w:pPr>
+            <w:r>
+              <w:rPr>
+                <w:rFonts w:ascii="Times New Roman" w:hAnsi="Times New Roman" w:eastAsia="宋体"/>
+                <w:b w:val="0"/>
+                <w:color w:val="000000"/>
+                <w:sz w:val="21"/>
+              </w:rPr>
+              <w:t>2</w:t>
+            </w:r>
+          </w:p>
+        </w:tc>
+        <w:tc>
+          <w:tcPr>
+            <w:tcW w:type="dxa" w:w="1814"/>
+            <w:vAlign w:val="center"/>
+          </w:tcPr>
+          <w:p>
+            <w:pPr>
+              <w:spacing w:after="0" w:line="280" w:lineRule="exact"/>
+              <w:ind w:firstLine="0"/>
+              <w:jc w:val="center"/>
+            </w:pPr>
+            <w:r>
+              <w:rPr>
+                <w:rFonts w:ascii="Times New Roman" w:hAnsi="Times New Roman" w:eastAsia="宋体"/>
+                <w:b w:val="0"/>
+                <w:color w:val="000000"/>
+                <w:sz w:val="21"/>
+              </w:rPr>
+              <w:t>56</w:t>
+            </w:r>
+          </w:p>
+        </w:tc>
+        <w:tc>
+          <w:tcPr>
+            <w:tcW w:type="dxa" w:w="3685"/>
+            <w:vAlign w:val="center"/>
+          </w:tcPr>
+          <w:p>
+            <w:pPr>
+              <w:spacing w:after="0" w:line="280" w:lineRule="exact"/>
+              <w:ind w:firstLine="0"/>
+              <w:jc w:val="center"/>
+            </w:pPr>
+            <w:r>
+              <w:rPr>
+                <w:rFonts w:ascii="Times New Roman" w:hAnsi="Times New Roman" w:eastAsia="宋体"/>
+                <w:b w:val="0"/>
+                <w:color w:val="000000"/>
+                <w:sz w:val="21"/>
+              </w:rPr>
+              <w:t>3,136</w:t>
+            </w:r>
+          </w:p>
+        </w:tc>
+        <w:tc>
+          <w:tcPr>
+            <w:tcW w:type="dxa" w:w="1587"/>
+            <w:vAlign w:val="center"/>
+          </w:tcPr>
+          <w:p>
+            <w:pPr>
+              <w:spacing w:after="0" w:line="280" w:lineRule="exact"/>
+              <w:ind w:firstLine="0"/>
+              <w:jc w:val="center"/>
+            </w:pPr>
+            <w:r>
+              <w:rPr>
+                <w:rFonts w:ascii="Times New Roman" w:hAnsi="Times New Roman" w:eastAsia="宋体"/>
+                <w:b w:val="0"/>
+                <w:color w:val="000000"/>
+                <w:sz w:val="21"/>
+              </w:rPr>
+              <w:t>0</w:t>
+            </w:r>
+          </w:p>
+        </w:tc>
+      </w:tr>
+      <w:tr>
+        <w:trPr>
+          <w:cantSplit/>
+        </w:trPr>
+        <w:tc>
+          <w:tcPr>
+            <w:tcW w:type="dxa" w:w="850"/>
+            <w:vAlign w:val="center"/>
+          </w:tcPr>
+          <w:p>
+            <w:pPr>
+              <w:spacing w:after="0" w:line="280" w:lineRule="exact"/>
+              <w:ind w:firstLine="0"/>
+              <w:jc w:val="center"/>
+            </w:pPr>
+            <w:r>
+              <w:rPr>
+                <w:rFonts w:ascii="Times New Roman" w:hAnsi="Times New Roman" w:eastAsia="宋体"/>
+                <w:b w:val="0"/>
+                <w:color w:val="000000"/>
+                <w:sz w:val="21"/>
+              </w:rPr>
+              <w:t>4</w:t>
+            </w:r>
+          </w:p>
+        </w:tc>
+        <w:tc>
+          <w:tcPr>
+            <w:tcW w:type="dxa" w:w="1134"/>
+            <w:vAlign w:val="center"/>
+          </w:tcPr>
+          <w:p>
+            <w:pPr>
+              <w:spacing w:after="0" w:line="280" w:lineRule="exact"/>
+              <w:ind w:firstLine="0"/>
+              <w:jc w:val="center"/>
+            </w:pPr>
+            <w:r>
+              <w:rPr>
+                <w:rFonts w:ascii="Times New Roman" w:hAnsi="Times New Roman" w:eastAsia="宋体"/>
+                <w:b w:val="0"/>
+                <w:color w:val="000000"/>
+                <w:sz w:val="21"/>
+              </w:rPr>
+              <w:t>3</w:t>
+            </w:r>
+          </w:p>
+        </w:tc>
+        <w:tc>
+          <w:tcPr>
+            <w:tcW w:type="dxa" w:w="1814"/>
+            <w:vAlign w:val="center"/>
+          </w:tcPr>
+          <w:p>
+            <w:pPr>
+              <w:spacing w:after="0" w:line="280" w:lineRule="exact"/>
+              <w:ind w:firstLine="0"/>
+              <w:jc w:val="center"/>
+            </w:pPr>
+            <w:r>
+              <w:rPr>
+                <w:rFonts w:ascii="Times New Roman" w:hAnsi="Times New Roman" w:eastAsia="宋体"/>
+                <w:b w:val="0"/>
+                <w:color w:val="000000"/>
+                <w:sz w:val="21"/>
+              </w:rPr>
+              <w:t>-1,736</w:t>
+            </w:r>
+          </w:p>
+        </w:tc>
+        <w:tc>
+          <w:tcPr>
+            <w:tcW w:type="dxa" w:w="3685"/>
+            <w:vAlign w:val="center"/>
+          </w:tcPr>
+          <w:p>
+            <w:pPr>
+              <w:spacing w:after="0" w:line="280" w:lineRule="exact"/>
+              <w:ind w:firstLine="0"/>
+              <w:jc w:val="center"/>
+            </w:pPr>
+            <w:r>
+              <w:rPr>
+                <w:rFonts w:ascii="Times New Roman" w:hAnsi="Times New Roman" w:eastAsia="宋体"/>
+                <w:b w:val="0"/>
+                <w:color w:val="000000"/>
+                <w:sz w:val="21"/>
+              </w:rPr>
+              <w:t>3,013,696</w:t>
+            </w:r>
+          </w:p>
+        </w:tc>
+        <w:tc>
+          <w:tcPr>
+            <w:tcW w:type="dxa" w:w="1587"/>
+            <w:vAlign w:val="center"/>
+          </w:tcPr>
+          <w:p>
+            <w:pPr>
+              <w:spacing w:after="0" w:line="280" w:lineRule="exact"/>
+              <w:ind w:firstLine="0"/>
+              <w:jc w:val="center"/>
+            </w:pPr>
+            <w:r>
+              <w:rPr>
+                <w:rFonts w:ascii="Times New Roman" w:hAnsi="Times New Roman" w:eastAsia="宋体"/>
+                <w:b w:val="0"/>
+                <w:color w:val="000000"/>
+                <w:sz w:val="21"/>
+              </w:rPr>
+              <w:t>0</w:t>
+            </w:r>
+          </w:p>
+        </w:tc>
+      </w:tr>
+      <w:tr>
+        <w:trPr>
+          <w:cantSplit/>
+        </w:trPr>
+        <w:tc>
+          <w:tcPr>
+            <w:tcW w:type="dxa" w:w="850"/>
+            <w:vAlign w:val="center"/>
+          </w:tcPr>
+          <w:p>
+            <w:pPr>
+              <w:spacing w:after="0" w:line="280" w:lineRule="exact"/>
+              <w:ind w:firstLine="0"/>
+              <w:jc w:val="center"/>
+            </w:pPr>
+            <w:r>
+              <w:rPr>
+                <w:rFonts w:ascii="Times New Roman" w:hAnsi="Times New Roman" w:eastAsia="宋体"/>
+                <w:b w:val="0"/>
+                <w:color w:val="000000"/>
+                <w:sz w:val="21"/>
+              </w:rPr>
+              <w:t>5</w:t>
+            </w:r>
+          </w:p>
+        </w:tc>
+        <w:tc>
+          <w:tcPr>
+            <w:tcW w:type="dxa" w:w="1134"/>
+            <w:vAlign w:val="center"/>
+          </w:tcPr>
+          <w:p>
+            <w:pPr>
+              <w:spacing w:after="0" w:line="280" w:lineRule="exact"/>
+              <w:ind w:firstLine="0"/>
+              <w:jc w:val="center"/>
+            </w:pPr>
+            <w:r>
+              <w:rPr>
+                <w:rFonts w:ascii="Times New Roman" w:hAnsi="Times New Roman" w:eastAsia="宋体"/>
+                <w:b w:val="0"/>
+                <w:color w:val="000000"/>
+                <w:sz w:val="21"/>
+              </w:rPr>
+              <w:t>4</w:t>
+            </w:r>
+          </w:p>
+        </w:tc>
+        <w:tc>
+          <w:tcPr>
+            <w:tcW w:type="dxa" w:w="1814"/>
+            <w:vAlign w:val="center"/>
+          </w:tcPr>
+          <w:p>
+            <w:pPr>
+              <w:spacing w:after="0" w:line="280" w:lineRule="exact"/>
+              <w:ind w:firstLine="0"/>
+              <w:jc w:val="center"/>
+            </w:pPr>
+            <w:r>
+              <w:rPr>
+                <w:rFonts w:ascii="Times New Roman" w:hAnsi="Times New Roman" w:eastAsia="宋体"/>
+                <w:b w:val="0"/>
+                <w:color w:val="000000"/>
+                <w:sz w:val="21"/>
+              </w:rPr>
+              <w:t>1,848</w:t>
+            </w:r>
+          </w:p>
+        </w:tc>
+        <w:tc>
+          <w:tcPr>
+            <w:tcW w:type="dxa" w:w="3685"/>
+            <w:vAlign w:val="center"/>
+          </w:tcPr>
+          <w:p>
+            <w:pPr>
+              <w:spacing w:after="0" w:line="280" w:lineRule="exact"/>
+              <w:ind w:firstLine="0"/>
+              <w:jc w:val="center"/>
+            </w:pPr>
+            <w:r>
+              <w:rPr>
+                <w:rFonts w:ascii="Times New Roman" w:hAnsi="Times New Roman" w:eastAsia="宋体"/>
+                <w:b w:val="0"/>
+                <w:color w:val="000000"/>
+                <w:sz w:val="21"/>
+              </w:rPr>
+              <w:t>3,415,104</w:t>
+            </w:r>
+          </w:p>
+        </w:tc>
+        <w:tc>
+          <w:tcPr>
+            <w:tcW w:type="dxa" w:w="1587"/>
+            <w:vAlign w:val="center"/>
+          </w:tcPr>
+          <w:p>
+            <w:pPr>
+              <w:spacing w:after="0" w:line="280" w:lineRule="exact"/>
+              <w:ind w:firstLine="0"/>
+              <w:jc w:val="center"/>
+            </w:pPr>
+            <w:r>
+              <w:rPr>
+                <w:rFonts w:ascii="Times New Roman" w:hAnsi="Times New Roman" w:eastAsia="宋体"/>
+                <w:b w:val="0"/>
+                <w:color w:val="000000"/>
+                <w:sz w:val="21"/>
+              </w:rPr>
+              <w:t>0</w:t>
+            </w:r>
+          </w:p>
+        </w:tc>
+      </w:tr>
+      <w:tr>
+        <w:trPr>
+          <w:cantSplit/>
+        </w:trPr>
+        <w:tc>
+          <w:tcPr>
+            <w:tcW w:type="dxa" w:w="850"/>
+            <w:vAlign w:val="center"/>
+          </w:tcPr>
+          <w:p>
+            <w:pPr>
+              <w:spacing w:after="0" w:line="280" w:lineRule="exact"/>
+              <w:ind w:firstLine="0"/>
+              <w:jc w:val="center"/>
+            </w:pPr>
+            <w:r>
+              <w:rPr>
+                <w:rFonts w:ascii="Times New Roman" w:hAnsi="Times New Roman" w:eastAsia="宋体"/>
+                <w:b w:val="0"/>
+                <w:color w:val="000000"/>
+                <w:sz w:val="21"/>
+              </w:rPr>
+              <w:t>6</w:t>
+            </w:r>
+          </w:p>
+        </w:tc>
+        <w:tc>
+          <w:tcPr>
+            <w:tcW w:type="dxa" w:w="1134"/>
+            <w:vAlign w:val="center"/>
+          </w:tcPr>
+          <w:p>
+            <w:pPr>
+              <w:spacing w:after="0" w:line="280" w:lineRule="exact"/>
+              <w:ind w:firstLine="0"/>
+              <w:jc w:val="center"/>
+            </w:pPr>
+            <w:r>
+              <w:rPr>
+                <w:rFonts w:ascii="Times New Roman" w:hAnsi="Times New Roman" w:eastAsia="宋体"/>
+                <w:b w:val="0"/>
+                <w:color w:val="000000"/>
+                <w:sz w:val="21"/>
+              </w:rPr>
+              <w:t>5</w:t>
+            </w:r>
+          </w:p>
+        </w:tc>
+        <w:tc>
+          <w:tcPr>
+            <w:tcW w:type="dxa" w:w="1814"/>
+            <w:vAlign w:val="center"/>
+          </w:tcPr>
+          <w:p>
+            <w:pPr>
+              <w:spacing w:after="0" w:line="280" w:lineRule="exact"/>
+              <w:ind w:firstLine="0"/>
+              <w:jc w:val="center"/>
+            </w:pPr>
+            <w:r>
+              <w:rPr>
+                <w:rFonts w:ascii="Times New Roman" w:hAnsi="Times New Roman" w:eastAsia="宋体"/>
+                <w:b w:val="0"/>
+                <w:color w:val="000000"/>
+                <w:sz w:val="21"/>
+              </w:rPr>
+              <w:t>-56</w:t>
+            </w:r>
+          </w:p>
+        </w:tc>
+        <w:tc>
+          <w:tcPr>
+            <w:tcW w:type="dxa" w:w="3685"/>
+            <w:vAlign w:val="center"/>
+          </w:tcPr>
+          <w:p>
+            <w:pPr>
+              <w:spacing w:after="0" w:line="280" w:lineRule="exact"/>
+              <w:ind w:firstLine="0"/>
+              <w:jc w:val="center"/>
+            </w:pPr>
+            <w:r>
+              <w:rPr>
+                <w:rFonts w:ascii="Times New Roman" w:hAnsi="Times New Roman" w:eastAsia="宋体"/>
+                <w:b w:val="0"/>
+                <w:color w:val="000000"/>
+                <w:sz w:val="21"/>
+              </w:rPr>
+              <w:t>3,136</w:t>
+            </w:r>
+          </w:p>
+        </w:tc>
+        <w:tc>
+          <w:tcPr>
+            <w:tcW w:type="dxa" w:w="1587"/>
+            <w:vAlign w:val="center"/>
+          </w:tcPr>
+          <w:p>
+            <w:pPr>
+              <w:spacing w:after="0" w:line="280" w:lineRule="exact"/>
+              <w:ind w:firstLine="0"/>
+              <w:jc w:val="center"/>
+            </w:pPr>
+            <w:r>
+              <w:rPr>
+                <w:rFonts w:ascii="Times New Roman" w:hAnsi="Times New Roman" w:eastAsia="宋体"/>
+                <w:b w:val="0"/>
+                <w:color w:val="000000"/>
+                <w:sz w:val="21"/>
+              </w:rPr>
+              <w:t>0</w:t>
+            </w:r>
+          </w:p>
+        </w:tc>
+      </w:tr>
+      <w:tr>
+        <w:trPr>
+          <w:cantSplit/>
+        </w:trPr>
+        <w:tc>
+          <w:tcPr>
+            <w:tcW w:type="dxa" w:w="850"/>
+            <w:vAlign w:val="center"/>
+          </w:tcPr>
+          <w:p>
+            <w:pPr>
+              <w:spacing w:after="0" w:line="280" w:lineRule="exact"/>
+              <w:ind w:firstLine="0"/>
+              <w:jc w:val="center"/>
+            </w:pPr>
+            <w:r>
+              <w:rPr>
+                <w:rFonts w:ascii="Times New Roman" w:hAnsi="Times New Roman" w:eastAsia="宋体"/>
+                <w:b w:val="0"/>
+                <w:color w:val="000000"/>
+                <w:sz w:val="21"/>
+              </w:rPr>
+              <w:t>7</w:t>
+            </w:r>
+          </w:p>
+        </w:tc>
+        <w:tc>
+          <w:tcPr>
+            <w:tcW w:type="dxa" w:w="1134"/>
+            <w:vAlign w:val="center"/>
+          </w:tcPr>
+          <w:p>
+            <w:pPr>
+              <w:spacing w:after="0" w:line="280" w:lineRule="exact"/>
+              <w:ind w:firstLine="0"/>
+              <w:jc w:val="center"/>
+            </w:pPr>
+            <w:r>
+              <w:rPr>
+                <w:rFonts w:ascii="Times New Roman" w:hAnsi="Times New Roman" w:eastAsia="宋体"/>
+                <w:b w:val="0"/>
+                <w:color w:val="000000"/>
+                <w:sz w:val="21"/>
+              </w:rPr>
+              <w:t>6</w:t>
+            </w:r>
+          </w:p>
+        </w:tc>
+        <w:tc>
+          <w:tcPr>
+            <w:tcW w:type="dxa" w:w="1814"/>
+            <w:vAlign w:val="center"/>
+          </w:tcPr>
+          <w:p>
+            <w:pPr>
+              <w:spacing w:after="0" w:line="280" w:lineRule="exact"/>
+              <w:ind w:firstLine="0"/>
+              <w:jc w:val="center"/>
+            </w:pPr>
+            <w:r>
+              <w:rPr>
+                <w:rFonts w:ascii="Times New Roman" w:hAnsi="Times New Roman" w:eastAsia="宋体"/>
+                <w:b w:val="0"/>
+                <w:color w:val="000000"/>
+                <w:sz w:val="21"/>
+              </w:rPr>
+              <w:t>-1,848</w:t>
+            </w:r>
+          </w:p>
+        </w:tc>
+        <w:tc>
+          <w:tcPr>
+            <w:tcW w:type="dxa" w:w="3685"/>
+            <w:vAlign w:val="center"/>
+          </w:tcPr>
+          <w:p>
+            <w:pPr>
+              <w:spacing w:after="0" w:line="280" w:lineRule="exact"/>
+              <w:ind w:firstLine="0"/>
+              <w:jc w:val="center"/>
+            </w:pPr>
+            <w:r>
+              <w:rPr>
+                <w:rFonts w:ascii="Times New Roman" w:hAnsi="Times New Roman" w:eastAsia="宋体"/>
+                <w:b w:val="0"/>
+                <w:color w:val="000000"/>
+                <w:sz w:val="21"/>
+              </w:rPr>
+              <w:t>3,415,104</w:t>
+            </w:r>
+          </w:p>
+        </w:tc>
+        <w:tc>
+          <w:tcPr>
+            <w:tcW w:type="dxa" w:w="1587"/>
+            <w:vAlign w:val="center"/>
+          </w:tcPr>
+          <w:p>
+            <w:pPr>
+              <w:spacing w:after="0" w:line="280" w:lineRule="exact"/>
+              <w:ind w:firstLine="0"/>
+              <w:jc w:val="center"/>
+            </w:pPr>
+            <w:r>
+              <w:rPr>
+                <w:rFonts w:ascii="Times New Roman" w:hAnsi="Times New Roman" w:eastAsia="宋体"/>
+                <w:b w:val="0"/>
+                <w:color w:val="000000"/>
+                <w:sz w:val="21"/>
+              </w:rPr>
+              <w:t>0</w:t>
+            </w:r>
+          </w:p>
+        </w:tc>
+      </w:tr>
+      <w:tr>
+        <w:trPr>
+          <w:cantSplit/>
+        </w:trPr>
+        <w:tc>
+          <w:tcPr>
+            <w:tcW w:type="dxa" w:w="850"/>
+            <w:vAlign w:val="center"/>
+          </w:tcPr>
+          <w:p>
+            <w:pPr>
+              <w:spacing w:after="0" w:line="280" w:lineRule="exact"/>
+              <w:ind w:firstLine="0"/>
+              <w:jc w:val="center"/>
+            </w:pPr>
+            <w:r>
+              <w:rPr>
+                <w:rFonts w:ascii="Times New Roman" w:hAnsi="Times New Roman" w:eastAsia="宋体"/>
+                <w:b w:val="0"/>
+                <w:color w:val="000000"/>
+                <w:sz w:val="21"/>
+              </w:rPr>
+              <w:t>8</w:t>
+            </w:r>
+          </w:p>
+        </w:tc>
+        <w:tc>
+          <w:tcPr>
+            <w:tcW w:type="dxa" w:w="1134"/>
+            <w:vAlign w:val="center"/>
+          </w:tcPr>
+          <w:p>
+            <w:pPr>
+              <w:spacing w:after="0" w:line="280" w:lineRule="exact"/>
+              <w:ind w:firstLine="0"/>
+              <w:jc w:val="center"/>
+            </w:pPr>
+            <w:r>
+              <w:rPr>
+                <w:rFonts w:ascii="Times New Roman" w:hAnsi="Times New Roman" w:eastAsia="宋体"/>
+                <w:b w:val="0"/>
+                <w:color w:val="000000"/>
+                <w:sz w:val="21"/>
+              </w:rPr>
+              <w:t>7</w:t>
+            </w:r>
+          </w:p>
+        </w:tc>
+        <w:tc>
+          <w:tcPr>
+            <w:tcW w:type="dxa" w:w="1814"/>
+            <w:vAlign w:val="center"/>
+          </w:tcPr>
+          <w:p>
+            <w:pPr>
+              <w:spacing w:after="0" w:line="280" w:lineRule="exact"/>
+              <w:ind w:firstLine="0"/>
+              <w:jc w:val="center"/>
+            </w:pPr>
+            <w:r>
+              <w:rPr>
+                <w:rFonts w:ascii="Times New Roman" w:hAnsi="Times New Roman" w:eastAsia="宋体"/>
+                <w:b w:val="0"/>
+                <w:color w:val="000000"/>
+                <w:sz w:val="21"/>
+              </w:rPr>
+              <w:t>1,848</w:t>
+            </w:r>
+          </w:p>
+        </w:tc>
+        <w:tc>
+          <w:tcPr>
+            <w:tcW w:type="dxa" w:w="3685"/>
+            <w:vAlign w:val="center"/>
+          </w:tcPr>
+          <w:p>
+            <w:pPr>
+              <w:spacing w:after="0" w:line="280" w:lineRule="exact"/>
+              <w:ind w:firstLine="0"/>
+              <w:jc w:val="center"/>
+            </w:pPr>
+            <w:r>
+              <w:rPr>
+                <w:rFonts w:ascii="Times New Roman" w:hAnsi="Times New Roman" w:eastAsia="宋体"/>
+                <w:b w:val="0"/>
+                <w:color w:val="000000"/>
+                <w:sz w:val="21"/>
+              </w:rPr>
+              <w:t>3,415,104</w:t>
+            </w:r>
+          </w:p>
+        </w:tc>
+        <w:tc>
+          <w:tcPr>
+            <w:tcW w:type="dxa" w:w="1587"/>
+            <w:vAlign w:val="center"/>
+          </w:tcPr>
+          <w:p>
+            <w:pPr>
+              <w:spacing w:after="0" w:line="280" w:lineRule="exact"/>
+              <w:ind w:firstLine="0"/>
+              <w:jc w:val="center"/>
+            </w:pPr>
+            <w:r>
+              <w:rPr>
+                <w:rFonts w:ascii="Times New Roman" w:hAnsi="Times New Roman" w:eastAsia="宋体"/>
+                <w:b w:val="0"/>
+                <w:color w:val="000000"/>
+                <w:sz w:val="21"/>
+              </w:rPr>
+              <w:t>0</w:t>
+            </w:r>
+          </w:p>
+        </w:tc>
+      </w:tr>
+      <w:tr>
+        <w:trPr>
+          <w:cantSplit/>
+        </w:trPr>
+        <w:tc>
+          <w:tcPr>
+            <w:tcW w:type="dxa" w:w="850"/>
+            <w:vAlign w:val="center"/>
+          </w:tcPr>
+          <w:p>
+            <w:pPr>
+              <w:spacing w:after="0" w:line="280" w:lineRule="exact"/>
+              <w:ind w:firstLine="0"/>
+              <w:jc w:val="center"/>
+            </w:pPr>
+            <w:r>
+              <w:rPr>
+                <w:rFonts w:ascii="Times New Roman" w:hAnsi="Times New Roman" w:eastAsia="宋体"/>
+                <w:b w:val="0"/>
+                <w:color w:val="000000"/>
+                <w:sz w:val="21"/>
+              </w:rPr>
+              <w:t>9</w:t>
+            </w:r>
+          </w:p>
+        </w:tc>
+        <w:tc>
+          <w:tcPr>
+            <w:tcW w:type="dxa" w:w="1134"/>
+            <w:vAlign w:val="center"/>
+          </w:tcPr>
+          <w:p>
+            <w:pPr>
+              <w:spacing w:after="0" w:line="280" w:lineRule="exact"/>
+              <w:ind w:firstLine="0"/>
+              <w:jc w:val="center"/>
+            </w:pPr>
+            <w:r>
+              <w:rPr>
+                <w:rFonts w:ascii="Times New Roman" w:hAnsi="Times New Roman" w:eastAsia="宋体"/>
+                <w:b w:val="0"/>
+                <w:color w:val="000000"/>
+                <w:sz w:val="21"/>
+              </w:rPr>
+              <w:t>8</w:t>
+            </w:r>
+          </w:p>
+        </w:tc>
+        <w:tc>
+          <w:tcPr>
+            <w:tcW w:type="dxa" w:w="1814"/>
+            <w:vAlign w:val="center"/>
+          </w:tcPr>
+          <w:p>
+            <w:pPr>
+              <w:spacing w:after="0" w:line="280" w:lineRule="exact"/>
+              <w:ind w:firstLine="0"/>
+              <w:jc w:val="center"/>
+            </w:pPr>
+            <w:r>
+              <w:rPr>
+                <w:rFonts w:ascii="Times New Roman" w:hAnsi="Times New Roman" w:eastAsia="宋体"/>
+                <w:b w:val="0"/>
+                <w:color w:val="000000"/>
+                <w:sz w:val="21"/>
+              </w:rPr>
+              <w:t>-56</w:t>
+            </w:r>
+          </w:p>
+        </w:tc>
+        <w:tc>
+          <w:tcPr>
+            <w:tcW w:type="dxa" w:w="3685"/>
+            <w:vAlign w:val="center"/>
+          </w:tcPr>
+          <w:p>
+            <w:pPr>
+              <w:spacing w:after="0" w:line="280" w:lineRule="exact"/>
+              <w:ind w:firstLine="0"/>
+              <w:jc w:val="center"/>
+            </w:pPr>
+            <w:r>
+              <w:rPr>
+                <w:rFonts w:ascii="Times New Roman" w:hAnsi="Times New Roman" w:eastAsia="宋体"/>
+                <w:b w:val="0"/>
+                <w:color w:val="000000"/>
+                <w:sz w:val="21"/>
+              </w:rPr>
+              <w:t>3,136</w:t>
+            </w:r>
+          </w:p>
+        </w:tc>
+        <w:tc>
+          <w:tcPr>
+            <w:tcW w:type="dxa" w:w="1587"/>
+            <w:vAlign w:val="center"/>
+          </w:tcPr>
+          <w:p>
+            <w:pPr>
+              <w:spacing w:after="0" w:line="280" w:lineRule="exact"/>
+              <w:ind w:firstLine="0"/>
+              <w:jc w:val="center"/>
+            </w:pPr>
+            <w:r>
+              <w:rPr>
+                <w:rFonts w:ascii="Times New Roman" w:hAnsi="Times New Roman" w:eastAsia="宋体"/>
+                <w:b w:val="0"/>
+                <w:color w:val="000000"/>
+                <w:sz w:val="21"/>
+              </w:rPr>
+              <w:t>0</w:t>
+            </w:r>
+          </w:p>
+        </w:tc>
+      </w:tr>
+      <w:tr>
+        <w:trPr>
+          <w:cantSplit/>
+        </w:trPr>
+        <w:tc>
+          <w:tcPr>
+            <w:tcW w:type="dxa" w:w="850"/>
+            <w:vAlign w:val="center"/>
+          </w:tcPr>
+          <w:p>
+            <w:pPr>
+              <w:spacing w:after="0" w:line="280" w:lineRule="exact"/>
+              <w:ind w:firstLine="0"/>
+              <w:jc w:val="center"/>
+            </w:pPr>
+            <w:r>
+              <w:rPr>
+                <w:rFonts w:ascii="Times New Roman" w:hAnsi="Times New Roman" w:eastAsia="宋体"/>
+                <w:b w:val="0"/>
+                <w:color w:val="000000"/>
+                <w:sz w:val="21"/>
+              </w:rPr>
+              <w:t>10</w:t>
+            </w:r>
+          </w:p>
+        </w:tc>
+        <w:tc>
+          <w:tcPr>
+            <w:tcW w:type="dxa" w:w="1134"/>
+            <w:vAlign w:val="center"/>
+          </w:tcPr>
+          <w:p>
+            <w:pPr>
+              <w:spacing w:after="0" w:line="280" w:lineRule="exact"/>
+              <w:ind w:firstLine="0"/>
+              <w:jc w:val="center"/>
+            </w:pPr>
+            <w:r>
+              <w:rPr>
+                <w:rFonts w:ascii="Times New Roman" w:hAnsi="Times New Roman" w:eastAsia="宋体"/>
+                <w:b w:val="0"/>
+                <w:color w:val="000000"/>
+                <w:sz w:val="21"/>
+              </w:rPr>
+              <w:t>9</w:t>
+            </w:r>
+          </w:p>
+        </w:tc>
+        <w:tc>
+          <w:tcPr>
+            <w:tcW w:type="dxa" w:w="1814"/>
+            <w:vAlign w:val="center"/>
+          </w:tcPr>
+          <w:p>
+            <w:pPr>
+              <w:spacing w:after="0" w:line="280" w:lineRule="exact"/>
+              <w:ind w:firstLine="0"/>
+              <w:jc w:val="center"/>
+            </w:pPr>
+            <w:r>
+              <w:rPr>
+                <w:rFonts w:ascii="Times New Roman" w:hAnsi="Times New Roman" w:eastAsia="宋体"/>
+                <w:b w:val="0"/>
+                <w:color w:val="000000"/>
+                <w:sz w:val="21"/>
+              </w:rPr>
+              <w:t>-56</w:t>
+            </w:r>
+          </w:p>
+        </w:tc>
+        <w:tc>
+          <w:tcPr>
+            <w:tcW w:type="dxa" w:w="3685"/>
+            <w:vAlign w:val="center"/>
+          </w:tcPr>
+          <w:p>
+            <w:pPr>
+              <w:spacing w:after="0" w:line="280" w:lineRule="exact"/>
+              <w:ind w:firstLine="0"/>
+              <w:jc w:val="center"/>
+            </w:pPr>
+            <w:r>
+              <w:rPr>
+                <w:rFonts w:ascii="Times New Roman" w:hAnsi="Times New Roman" w:eastAsia="宋体"/>
+                <w:b w:val="0"/>
+                <w:color w:val="000000"/>
+                <w:sz w:val="21"/>
+              </w:rPr>
+              <w:t>3,136</w:t>
+            </w:r>
+          </w:p>
+        </w:tc>
+        <w:tc>
+          <w:tcPr>
+            <w:tcW w:type="dxa" w:w="1587"/>
+            <w:vAlign w:val="center"/>
+          </w:tcPr>
+          <w:p>
+            <w:pPr>
+              <w:spacing w:after="0" w:line="280" w:lineRule="exact"/>
+              <w:ind w:firstLine="0"/>
+              <w:jc w:val="center"/>
+            </w:pPr>
+            <w:r>
+              <w:rPr>
+                <w:rFonts w:ascii="Times New Roman" w:hAnsi="Times New Roman" w:eastAsia="宋体"/>
+                <w:b w:val="0"/>
+                <w:color w:val="000000"/>
+                <w:sz w:val="21"/>
+              </w:rPr>
+              <w:t>0</w:t>
+            </w:r>
+          </w:p>
+        </w:tc>
+      </w:tr>
+      <w:tr>
+        <w:trPr>
+          <w:cantSplit/>
+        </w:trPr>
+        <w:tc>
+          <w:tcPr>
+            <w:tcW w:type="dxa" w:w="850"/>
+            <w:vAlign w:val="center"/>
+          </w:tcPr>
+          <w:p>
+            <w:pPr>
+              <w:spacing w:after="0" w:line="280" w:lineRule="exact"/>
+              <w:ind w:firstLine="0"/>
+              <w:jc w:val="center"/>
+            </w:pPr>
+            <w:r>
+              <w:rPr>
+                <w:rFonts w:ascii="Times New Roman" w:hAnsi="Times New Roman" w:eastAsia="宋体"/>
+                <w:b w:val="0"/>
+                <w:color w:val="000000"/>
+                <w:sz w:val="21"/>
+              </w:rPr>
+              <w:t>11</w:t>
+            </w:r>
+          </w:p>
+        </w:tc>
+        <w:tc>
+          <w:tcPr>
+            <w:tcW w:type="dxa" w:w="1134"/>
+            <w:vAlign w:val="center"/>
+          </w:tcPr>
+          <w:p>
+            <w:pPr>
+              <w:spacing w:after="0" w:line="280" w:lineRule="exact"/>
+              <w:ind w:firstLine="0"/>
+              <w:jc w:val="center"/>
+            </w:pPr>
+            <w:r>
+              <w:rPr>
+                <w:rFonts w:ascii="Times New Roman" w:hAnsi="Times New Roman" w:eastAsia="宋体"/>
+                <w:b w:val="0"/>
+                <w:color w:val="000000"/>
+                <w:sz w:val="21"/>
+              </w:rPr>
+              <w:t>10</w:t>
+            </w:r>
+          </w:p>
+        </w:tc>
+        <w:tc>
+          <w:tcPr>
+            <w:tcW w:type="dxa" w:w="1814"/>
+            <w:vAlign w:val="center"/>
+          </w:tcPr>
+          <w:p>
+            <w:pPr>
+              <w:spacing w:after="0" w:line="280" w:lineRule="exact"/>
+              <w:ind w:firstLine="0"/>
+              <w:jc w:val="center"/>
+            </w:pPr>
+            <w:r>
+              <w:rPr>
+                <w:rFonts w:ascii="Times New Roman" w:hAnsi="Times New Roman" w:eastAsia="宋体"/>
+                <w:b w:val="0"/>
+                <w:color w:val="000000"/>
+                <w:sz w:val="21"/>
+              </w:rPr>
+              <w:t>-57,288</w:t>
+            </w:r>
+          </w:p>
+        </w:tc>
+        <w:tc>
+          <w:tcPr>
+            <w:tcW w:type="dxa" w:w="3685"/>
+            <w:vAlign w:val="center"/>
+          </w:tcPr>
+          <w:p>
+            <w:pPr>
+              <w:spacing w:after="0" w:line="280" w:lineRule="exact"/>
+              <w:ind w:firstLine="0"/>
+              <w:jc w:val="center"/>
+            </w:pPr>
+            <w:r>
+              <w:rPr>
+                <w:rFonts w:ascii="Times New Roman" w:hAnsi="Times New Roman" w:eastAsia="宋体"/>
+                <w:b w:val="0"/>
+                <w:color w:val="000000"/>
+                <w:sz w:val="21"/>
+              </w:rPr>
+              <w:t>3,281,914,944</w:t>
+            </w:r>
+          </w:p>
+        </w:tc>
+        <w:tc>
+          <w:tcPr>
+            <w:tcW w:type="dxa" w:w="1587"/>
+            <w:vAlign w:val="center"/>
+          </w:tcPr>
+          <w:p>
+            <w:pPr>
+              <w:spacing w:after="0" w:line="280" w:lineRule="exact"/>
+              <w:ind w:firstLine="0"/>
+              <w:jc w:val="center"/>
+            </w:pPr>
+            <w:r>
+              <w:rPr>
+                <w:rFonts w:ascii="Times New Roman" w:hAnsi="Times New Roman" w:eastAsia="宋体"/>
+                <w:b w:val="0"/>
+                <w:color w:val="000000"/>
+                <w:sz w:val="21"/>
+              </w:rPr>
+              <w:t>1</w:t>
+            </w:r>
+          </w:p>
+        </w:tc>
+      </w:tr>
+      <w:tr>
+        <w:trPr>
+          <w:cantSplit/>
+        </w:trPr>
+        <w:tc>
+          <w:tcPr>
+            <w:tcW w:type="dxa" w:w="850"/>
+            <w:vAlign w:val="center"/>
+          </w:tcPr>
+          <w:p>
+            <w:pPr>
+              <w:spacing w:after="0" w:line="280" w:lineRule="exact"/>
+              <w:ind w:firstLine="0"/>
+              <w:jc w:val="center"/>
+            </w:pPr>
+            <w:r>
+              <w:rPr>
+                <w:rFonts w:ascii="Times New Roman" w:hAnsi="Times New Roman" w:eastAsia="宋体"/>
+                <w:b w:val="0"/>
+                <w:color w:val="000000"/>
+                <w:sz w:val="21"/>
+              </w:rPr>
+              <w:t>12</w:t>
+            </w:r>
+          </w:p>
+        </w:tc>
+        <w:tc>
+          <w:tcPr>
+            <w:tcW w:type="dxa" w:w="1134"/>
+            <w:vAlign w:val="center"/>
+          </w:tcPr>
+          <w:p>
+            <w:pPr>
+              <w:spacing w:after="0" w:line="280" w:lineRule="exact"/>
+              <w:ind w:firstLine="0"/>
+              <w:jc w:val="center"/>
+            </w:pPr>
+            <w:r>
+              <w:rPr>
+                <w:rFonts w:ascii="Times New Roman" w:hAnsi="Times New Roman" w:eastAsia="宋体"/>
+                <w:b w:val="0"/>
+                <w:color w:val="000000"/>
+                <w:sz w:val="21"/>
+              </w:rPr>
+              <w:t>10</w:t>
+            </w:r>
+          </w:p>
+        </w:tc>
+        <w:tc>
+          <w:tcPr>
+            <w:tcW w:type="dxa" w:w="1814"/>
+            <w:vAlign w:val="center"/>
+          </w:tcPr>
+          <w:p>
+            <w:pPr>
+              <w:spacing w:after="0" w:line="280" w:lineRule="exact"/>
+              <w:ind w:firstLine="0"/>
+              <w:jc w:val="center"/>
+            </w:pPr>
+            <w:r>
+              <w:rPr>
+                <w:rFonts w:ascii="Times New Roman" w:hAnsi="Times New Roman" w:eastAsia="宋体"/>
+                <w:b w:val="0"/>
+                <w:color w:val="000000"/>
+                <w:sz w:val="21"/>
+              </w:rPr>
+              <w:t>57,288</w:t>
+            </w:r>
+          </w:p>
+        </w:tc>
+        <w:tc>
+          <w:tcPr>
+            <w:tcW w:type="dxa" w:w="3685"/>
+            <w:vAlign w:val="center"/>
+          </w:tcPr>
+          <w:p>
+            <w:pPr>
+              <w:spacing w:after="0" w:line="280" w:lineRule="exact"/>
+              <w:ind w:firstLine="0"/>
+              <w:jc w:val="center"/>
+            </w:pPr>
+            <w:r>
+              <w:rPr>
+                <w:rFonts w:ascii="Times New Roman" w:hAnsi="Times New Roman" w:eastAsia="宋体"/>
+                <w:b w:val="0"/>
+                <w:color w:val="000000"/>
+                <w:sz w:val="21"/>
+              </w:rPr>
+              <w:t>3,281,914,944</w:t>
+            </w:r>
+          </w:p>
+        </w:tc>
+        <w:tc>
+          <w:tcPr>
+            <w:tcW w:type="dxa" w:w="1587"/>
+            <w:vAlign w:val="center"/>
+          </w:tcPr>
+          <w:p>
+            <w:pPr>
+              <w:spacing w:after="0" w:line="280" w:lineRule="exact"/>
+              <w:ind w:firstLine="0"/>
+              <w:jc w:val="center"/>
+            </w:pPr>
+            <w:r>
+              <w:rPr>
+                <w:rFonts w:ascii="Times New Roman" w:hAnsi="Times New Roman" w:eastAsia="宋体"/>
+                <w:b w:val="0"/>
+                <w:color w:val="000000"/>
+                <w:sz w:val="21"/>
+              </w:rPr>
+              <w:t>1</w:t>
+            </w:r>
+          </w:p>
+        </w:tc>
+      </w:tr>
+      <w:tr>
+        <w:trPr>
+          <w:cantSplit/>
+        </w:trPr>
+        <w:tc>
+          <w:tcPr>
+            <w:tcW w:type="dxa" w:w="850"/>
+            <w:vAlign w:val="center"/>
+          </w:tcPr>
+          <w:p>
+            <w:pPr>
+              <w:spacing w:after="0" w:line="280" w:lineRule="exact"/>
+              <w:ind w:firstLine="0"/>
+              <w:jc w:val="center"/>
+            </w:pPr>
+            <w:r>
+              <w:rPr>
+                <w:rFonts w:ascii="Times New Roman" w:hAnsi="Times New Roman" w:eastAsia="宋体"/>
+                <w:b w:val="0"/>
+                <w:color w:val="000000"/>
+                <w:sz w:val="21"/>
+              </w:rPr>
+              <w:t>13</w:t>
+            </w:r>
+          </w:p>
+        </w:tc>
+        <w:tc>
+          <w:tcPr>
+            <w:tcW w:type="dxa" w:w="1134"/>
+            <w:vAlign w:val="center"/>
+          </w:tcPr>
+          <w:p>
+            <w:pPr>
+              <w:spacing w:after="0" w:line="280" w:lineRule="exact"/>
+              <w:ind w:firstLine="0"/>
+              <w:jc w:val="center"/>
+            </w:pPr>
+            <w:r>
+              <w:rPr>
+                <w:rFonts w:ascii="Times New Roman" w:hAnsi="Times New Roman" w:eastAsia="宋体"/>
+                <w:b w:val="0"/>
+                <w:color w:val="000000"/>
+                <w:sz w:val="21"/>
+              </w:rPr>
+              <w:t>10</w:t>
+            </w:r>
+          </w:p>
+        </w:tc>
+        <w:tc>
+          <w:tcPr>
+            <w:tcW w:type="dxa" w:w="1814"/>
+            <w:vAlign w:val="center"/>
+          </w:tcPr>
+          <w:p>
+            <w:pPr>
+              <w:spacing w:after="0" w:line="280" w:lineRule="exact"/>
+              <w:ind w:firstLine="0"/>
+              <w:jc w:val="center"/>
+            </w:pPr>
+            <w:r>
+              <w:rPr>
+                <w:rFonts w:ascii="Times New Roman" w:hAnsi="Times New Roman" w:eastAsia="宋体"/>
+                <w:b w:val="0"/>
+                <w:color w:val="000000"/>
+                <w:sz w:val="21"/>
+              </w:rPr>
+              <w:t>-57,288</w:t>
+            </w:r>
+          </w:p>
+        </w:tc>
+        <w:tc>
+          <w:tcPr>
+            <w:tcW w:type="dxa" w:w="3685"/>
+            <w:vAlign w:val="center"/>
+          </w:tcPr>
+          <w:p>
+            <w:pPr>
+              <w:spacing w:after="0" w:line="280" w:lineRule="exact"/>
+              <w:ind w:firstLine="0"/>
+              <w:jc w:val="center"/>
+            </w:pPr>
+            <w:r>
+              <w:rPr>
+                <w:rFonts w:ascii="Times New Roman" w:hAnsi="Times New Roman" w:eastAsia="宋体"/>
+                <w:b w:val="0"/>
+                <w:color w:val="000000"/>
+                <w:sz w:val="21"/>
+              </w:rPr>
+              <w:t>3,281,914,944</w:t>
+            </w:r>
+          </w:p>
+        </w:tc>
+        <w:tc>
+          <w:tcPr>
+            <w:tcW w:type="dxa" w:w="1587"/>
+            <w:vAlign w:val="center"/>
+          </w:tcPr>
+          <w:p>
+            <w:pPr>
+              <w:spacing w:after="0" w:line="280" w:lineRule="exact"/>
+              <w:ind w:firstLine="0"/>
+              <w:jc w:val="center"/>
+            </w:pPr>
+            <w:r>
+              <w:rPr>
+                <w:rFonts w:ascii="Times New Roman" w:hAnsi="Times New Roman" w:eastAsia="宋体"/>
+                <w:b w:val="0"/>
+                <w:color w:val="000000"/>
+                <w:sz w:val="21"/>
+              </w:rPr>
+              <w:t>1</w:t>
+            </w:r>
+          </w:p>
+        </w:tc>
+      </w:tr>
+    </w:tbl>
+    <w:p>
+      <w:pPr>
+        <w:spacing w:after="80" w:line="360" w:lineRule="exact" w:before="100"/>
+        <w:ind w:firstLine="482"/>
+        <w:jc w:val="both"/>
+      </w:pPr>
+      <w:r>
+        <w:rPr>
+          <w:rFonts w:ascii="Times New Roman" w:hAnsi="Times New Roman" w:eastAsia="宋体"/>
+          <w:b w:val="0"/>
+          <w:color w:val="000000"/>
+          <w:sz w:val="24"/>
+        </w:rPr>
+        <w:t>全部窗口的 I 均为 0。前 10 轮依次尝试位置 0～9，均未触发捕获；第 11 轮完成位置 10 的比较后，能量增大且 capture 置 1。第 12、13 轮保持位置 10，能量继续保持高值。</w:t>
+      </w:r>
+    </w:p>
+    <w:p>
+      <w:pPr>
+        <w:spacing w:line="240" w:lineRule="auto" w:before="80" w:after="100"/>
+        <w:jc w:val="center"/>
+      </w:pPr>
+      <m:oMath>
+        <m:r>
+          <m:t>R = </m:t>
+        </m:r>
+        <m:f>
+          <m:num>
+            <m:r>
+              <m:t>3,281,914,944</m:t>
+            </m:r>
+          </m:num>
+          <m:den>
+            <m:r>
+              <m:t>3,415,104</m:t>
+            </m:r>
+          </m:den>
+        </m:f>
+        <m:r>
+          <m:t> = 961 &gt; 100</m:t>
+        </m:r>
+      </m:oMath>
+    </w:p>
+    <w:p>
+      <w:pPr>
+        <w:spacing w:after="80" w:line="360" w:lineRule="exact"/>
+        <w:ind w:firstLine="482"/>
+        <w:jc w:val="both"/>
+      </w:pPr>
+      <w:r>
+        <w:rPr>
+          <w:rFonts w:ascii="Times New Roman" w:hAnsi="Times New Roman" w:eastAsia="宋体"/>
+          <w:b w:val="0"/>
+          <w:color w:val="000000"/>
+          <w:sz w:val="24"/>
+        </w:rPr>
+        <w:t>式中 R 为最小对齐能量与本次前 10 轮最大未对齐能量之比。选择最大错位值作为分母，避免用某一较低错位能量夸大差异。对齐能量为 3 281 914 944，最大未对齐能量为 3 415 104，相差 961 倍，满足超过两个数量级的要求。</w:t>
+      </w:r>
+    </w:p>
+    <w:p>
+      <w:pPr>
+        <w:spacing w:after="80" w:line="360" w:lineRule="exact"/>
+        <w:ind w:firstLine="482"/>
+        <w:jc w:val="both"/>
+      </w:pPr>
+      <w:r>
+        <w:rPr>
+          <w:rFonts w:ascii="Times New Roman" w:hAnsi="Times New Roman" w:eastAsia="宋体"/>
+          <w:b w:val="0"/>
+          <w:color w:val="000000"/>
+          <w:sz w:val="24"/>
+        </w:rPr>
+        <w:t>Q 在后三轮中依次为 −57288、+57288、−57288，这是 NH 符号变化引起的整体反相；平方后能量相同。三个对齐窗口的 49104 个有效样本中，信号码与本地码全部一致。硬件在第 11 轮已置位成功，后两轮只是继续复核。</w:t>
+      </w:r>
+    </w:p>
+    <w:p>
+      <w:pPr>
+        <w:spacing w:after="80" w:line="300" w:lineRule="exact"/>
+        <w:ind w:firstLine="0"/>
+        <w:jc w:val="both"/>
+      </w:pPr>
+      <w:r>
+        <w:rPr>
+          <w:rFonts w:ascii="Times New Roman" w:hAnsi="Times New Roman" w:eastAsia="宋体"/>
+          <w:b w:val="0"/>
+          <w:color w:val="000000"/>
+          <w:sz w:val="22"/>
+        </w:rPr>
+        <w:t>该结论针对固定 PRN、零多普勒、无噪声和当前输入幅度。961 倍是相对于实际搜索的前 10 个未对齐窗口得到的比值，不代表全部码位置或其他信号条件下的统一性能保证。</w:t>
+      </w:r>
+    </w:p>
+    <w:p>
+      <w:pPr>
+        <w:pStyle w:val="1"/>
+        <w:pageBreakBefore/>
+      </w:pPr>
+      <w:r>
+        <w:t>6 单星仿真波形记录</w:t>
+      </w:r>
+    </w:p>
+    <w:p>
+      <w:pPr>
+        <w:spacing w:after="80" w:line="300" w:lineRule="exact"/>
+        <w:ind w:firstLine="0"/>
+        <w:jc w:val="both"/>
+      </w:pPr>
+      <w:r>
+        <w:rPr>
+          <w:rFonts w:ascii="Times New Roman" w:hAnsi="Times New Roman" w:eastAsia="宋体"/>
+          <w:b w:val="0"/>
+          <w:color w:val="000000"/>
+          <w:sz w:val="22"/>
+        </w:rPr>
+        <w:t>单星波形记录使用同一次 RTL 仿真的结果，energy 采用无符号十进制显示。以 dump 定位窗口结果的更新边界，再比较未对齐和对齐后的码线。</w:t>
+      </w:r>
+    </w:p>
+    <w:p>
+      <w:pPr>
+        <w:pStyle w:val="21"/>
+        <w:pageBreakBefore w:val="0"/>
+      </w:pPr>
+      <w:r>
+        <w:t>6.1 捕获过程总览</w:t>
+      </w:r>
+    </w:p>
+    <w:tbl>
+      <w:tblPr>
+        <w:tblW w:type="auto" w:w="0"/>
+        <w:jc w:val="center"/>
+        <w:tblLayout w:type="fixed"/>
+        <w:tblLook w:firstColumn="1" w:firstRow="1" w:lastColumn="0" w:lastRow="0" w:noHBand="0" w:noVBand="1" w:val="04A0"/>
         <w:tblBorders>
           <w:top w:val="single" w:sz="4" w:color="D9D9D9"/>
           <w:left w:val="single" w:sz="4" w:color="D9D9D9"/>
@@ -215,22 +3980,16 @@
         </w:tblBorders>
       </w:tblPr>
       <w:tblGrid>
-        <w:gridCol w:w="9070"/>
+        <w:gridCol w:w="8901"/>
       </w:tblGrid>
       <w:tr>
         <w:trPr>
+          <w:trHeight w:val="2381" w:hRule="atLeast"/>
           <w:cantSplit/>
-          <w:trHeight w:val="2835" w:hRule="atLeast"/>
         </w:trPr>
         <w:tc>
           <w:tcPr>
-            <w:tcW w:w="9070" w:type="dxa"/>
-            <w:tcMar>
-              <w:top w:w="100" w:type="dxa"/>
-              <w:left w:w="100" w:type="dxa"/>
-              <w:bottom w:w="100" w:type="dxa"/>
-              <w:right w:w="100" w:type="dxa"/>
-            </w:tcMar>
+            <w:tcW w:type="dxa" w:w="8901"/>
           </w:tcPr>
           <w:p/>
         </w:tc>
@@ -238,40 +3997,51 @@
     </w:tbl>
     <w:p>
       <w:pPr>
-        <w:spacing w:after="240" w:line="240" w:lineRule="auto"/>
-        <w:ind w:firstLine="482"/>
+        <w:spacing w:after="80" w:line="300" w:lineRule="exact" w:before="80"/>
+        <w:ind w:firstLine="0"/>
+        <w:jc w:val="center"/>
+      </w:pPr>
+      <w:r>
+        <w:rPr>
+          <w:rFonts w:ascii="Times New Roman" w:hAnsi="Times New Roman" w:eastAsia="宋体"/>
+          <w:b w:val="0"/>
+          <w:color w:val="000000"/>
+          <w:sz w:val="19"/>
+        </w:rPr>
+        <w:t>图 2　单星捕获全过程  待插入仿真截图</w:t>
+      </w:r>
+    </w:p>
+    <w:p>
+      <w:pPr>
+        <w:spacing w:after="80" w:line="300" w:lineRule="exact"/>
+        <w:ind w:firstLine="0"/>
         <w:jc w:val="both"/>
+      </w:pPr>
+      <w:r>
         <w:rPr>
-          <w:lang w:eastAsia="zh-CN"/>
+          <w:rFonts w:ascii="Times New Roman" w:hAnsi="Times New Roman" w:eastAsia="宋体"/>
+          <w:b w:val="0"/>
+          <w:color w:val="000000"/>
+          <w:sz w:val="22"/>
         </w:rPr>
-      </w:pPr>
+        <w:t>总览取 0～14 ms。result_phase 先依次输出 0～9，再保持 10；energy 在第 11 轮完成时明显上升，capture 同时由 0 变为 1。dump 标记各完整窗口的结果更新。</w:t>
+      </w:r>
     </w:p>
     <w:p>
       <w:pPr>
         <w:pStyle w:val="21"/>
-        <w:rPr>
-          <w:lang w:eastAsia="zh-CN"/>
-        </w:rPr>
+        <w:pageBreakBefore w:val="0"/>
       </w:pPr>
       <w:r>
-        <w:rPr>
-          <w:rFonts w:ascii="Times New Roman" w:eastAsia="黑体" w:hAnsi="Times New Roman"/>
-          <w:lang w:eastAsia="zh-CN"/>
-        </w:rPr>
-        <w:t xml:space="preserve">2.2 未对齐波形</w:t>
-      </w:r>
-      <w:r>
-        <w:rPr>
-          <w:rFonts w:ascii="Times New Roman" w:eastAsia="黑体" w:hAnsi="Times New Roman"/>
-          <w:lang w:eastAsia="zh-CN"/>
-        </w:rPr>
-        <w:t/>
+        <w:t>6.2 未对齐时的码线</w:t>
       </w:r>
     </w:p>
     <w:tbl>
       <w:tblPr>
-        <w:tblW w:w="9070" w:type="dxa"/>
+        <w:tblW w:type="auto" w:w="0"/>
+        <w:jc w:val="center"/>
         <w:tblLayout w:type="fixed"/>
+        <w:tblLook w:firstColumn="1" w:firstRow="1" w:lastColumn="0" w:lastRow="0" w:noHBand="0" w:noVBand="1" w:val="04A0"/>
         <w:tblBorders>
           <w:top w:val="single" w:sz="4" w:color="D9D9D9"/>
           <w:left w:val="single" w:sz="4" w:color="D9D9D9"/>
@@ -280,22 +4050,16 @@
         </w:tblBorders>
       </w:tblPr>
       <w:tblGrid>
-        <w:gridCol w:w="9070"/>
+        <w:gridCol w:w="8901"/>
       </w:tblGrid>
       <w:tr>
         <w:trPr>
+          <w:trHeight w:val="1814" w:hRule="atLeast"/>
           <w:cantSplit/>
-          <w:trHeight w:val="2268" w:hRule="atLeast"/>
         </w:trPr>
         <w:tc>
           <w:tcPr>
-            <w:tcW w:w="9070" w:type="dxa"/>
-            <w:tcMar>
-              <w:top w:w="100" w:type="dxa"/>
-              <w:left w:w="100" w:type="dxa"/>
-              <w:bottom w:w="100" w:type="dxa"/>
-              <w:right w:w="100" w:type="dxa"/>
-            </w:tcMar>
+            <w:tcW w:type="dxa" w:w="8901"/>
           </w:tcPr>
           <w:p/>
         </w:tc>
@@ -303,40 +4067,51 @@
     </w:tbl>
     <w:p>
       <w:pPr>
-        <w:spacing w:after="240" w:line="240" w:lineRule="auto"/>
-        <w:ind w:firstLine="482"/>
+        <w:spacing w:after="80" w:line="300" w:lineRule="exact" w:before="80"/>
+        <w:ind w:firstLine="0"/>
+        <w:jc w:val="center"/>
+      </w:pPr>
+      <w:r>
+        <w:rPr>
+          <w:rFonts w:ascii="Times New Roman" w:hAnsi="Times New Roman" w:eastAsia="宋体"/>
+          <w:b w:val="0"/>
+          <w:color w:val="000000"/>
+          <w:sz w:val="19"/>
+        </w:rPr>
+        <w:t>图 3　未对齐状态的信号码与本地码  待插入仿真截图</w:t>
+      </w:r>
+    </w:p>
+    <w:p>
+      <w:pPr>
+        <w:spacing w:after="80" w:line="300" w:lineRule="exact"/>
+        <w:ind w:firstLine="0"/>
         <w:jc w:val="both"/>
+      </w:pPr>
+      <w:r>
         <w:rPr>
-          <w:lang w:eastAsia="zh-CN"/>
+          <w:rFonts w:ascii="Times New Roman" w:hAnsi="Times New Roman" w:eastAsia="宋体"/>
+          <w:b w:val="0"/>
+          <w:color w:val="000000"/>
+          <w:sz w:val="22"/>
         </w:rPr>
-      </w:pPr>
+        <w:t>放大 5.400～5.405 ms，signal_code 与 local_code 有多处不重合；该时刻最近一个已完成窗口的能量为 3 415 104，capture 仍为 0。</w:t>
+      </w:r>
     </w:p>
     <w:p>
       <w:pPr>
         <w:pStyle w:val="21"/>
-        <w:rPr>
-          <w:lang w:eastAsia="zh-CN"/>
-        </w:rPr>
+        <w:pageBreakBefore w:val="0"/>
       </w:pPr>
       <w:r>
-        <w:rPr>
-          <w:rFonts w:ascii="Times New Roman" w:eastAsia="黑体" w:hAnsi="Times New Roman"/>
-          <w:lang w:eastAsia="zh-CN"/>
-        </w:rPr>
-        <w:t xml:space="preserve">2.3 对齐后波形</w:t>
-      </w:r>
-      <w:r>
-        <w:rPr>
-          <w:rFonts w:ascii="Times New Roman" w:eastAsia="黑体" w:hAnsi="Times New Roman"/>
-          <w:lang w:eastAsia="zh-CN"/>
-        </w:rPr>
-        <w:t/>
+        <w:t>6.3 对齐后的码线</w:t>
       </w:r>
     </w:p>
     <w:tbl>
       <w:tblPr>
-        <w:tblW w:w="9070" w:type="dxa"/>
+        <w:tblW w:type="auto" w:w="0"/>
+        <w:jc w:val="center"/>
         <w:tblLayout w:type="fixed"/>
+        <w:tblLook w:firstColumn="1" w:firstRow="1" w:lastColumn="0" w:lastRow="0" w:noHBand="0" w:noVBand="1" w:val="04A0"/>
         <w:tblBorders>
           <w:top w:val="single" w:sz="4" w:color="D9D9D9"/>
           <w:left w:val="single" w:sz="4" w:color="D9D9D9"/>
@@ -345,22 +4120,16 @@
         </w:tblBorders>
       </w:tblPr>
       <w:tblGrid>
-        <w:gridCol w:w="9070"/>
+        <w:gridCol w:w="8901"/>
       </w:tblGrid>
       <w:tr>
         <w:trPr>
+          <w:trHeight w:val="1814" w:hRule="atLeast"/>
           <w:cantSplit/>
-          <w:trHeight w:val="2268" w:hRule="atLeast"/>
         </w:trPr>
         <w:tc>
           <w:tcPr>
-            <w:tcW w:w="9070" w:type="dxa"/>
-            <w:tcMar>
-              <w:top w:w="100" w:type="dxa"/>
-              <w:left w:w="100" w:type="dxa"/>
-              <w:bottom w:w="100" w:type="dxa"/>
-              <w:right w:w="100" w:type="dxa"/>
-            </w:tcMar>
+            <w:tcW w:type="dxa" w:w="8901"/>
           </w:tcPr>
           <w:p/>
         </w:tc>
@@ -368,45 +4137,563 @@
     </w:tbl>
     <w:p>
       <w:pPr>
-        <w:spacing w:after="240" w:line="240" w:lineRule="auto"/>
+        <w:spacing w:after="80" w:line="300" w:lineRule="exact" w:before="80"/>
+        <w:ind w:firstLine="0"/>
+        <w:jc w:val="center"/>
+      </w:pPr>
+      <w:r>
+        <w:rPr>
+          <w:rFonts w:ascii="Times New Roman" w:hAnsi="Times New Roman" w:eastAsia="宋体"/>
+          <w:b w:val="0"/>
+          <w:color w:val="000000"/>
+          <w:sz w:val="19"/>
+        </w:rPr>
+        <w:t>图 4　捕获成功后的信号码与本地码  待插入仿真截图</w:t>
+      </w:r>
+    </w:p>
+    <w:p>
+      <w:pPr>
+        <w:spacing w:after="80" w:line="300" w:lineRule="exact"/>
+        <w:ind w:firstLine="0"/>
+        <w:jc w:val="both"/>
+      </w:pPr>
+      <w:r>
+        <w:rPr>
+          <w:rFonts w:ascii="Times New Roman" w:hAnsi="Times New Roman" w:eastAsia="宋体"/>
+          <w:b w:val="0"/>
+          <w:color w:val="000000"/>
+          <w:sz w:val="22"/>
+        </w:rPr>
+        <w:t>放大 11.400～11.405 ms，两条码线的电平及跳变位置重合，energy 为 3 281 914 944，capture 为 1。此图展示成功后的保持阶段；结合图 2 可以确认找到该位置的时间。</w:t>
+      </w:r>
+    </w:p>
+    <w:p>
+      <w:pPr>
+        <w:pStyle w:val="1"/>
+        <w:pageBreakBefore/>
+      </w:pPr>
+      <w:r>
+        <w:t>7 补充验证与实验结论</w:t>
+      </w:r>
+    </w:p>
+    <w:p>
+      <w:pPr>
+        <w:spacing w:after="80" w:line="360" w:lineRule="exact"/>
         <w:ind w:firstLine="482"/>
         <w:jc w:val="both"/>
+      </w:pPr>
+      <w:r>
         <w:rPr>
-          <w:lang w:eastAsia="zh-CN"/>
+          <w:rFonts w:ascii="Times New Roman" w:hAnsi="Times New Roman" w:eastAsia="宋体"/>
+          <w:b w:val="0"/>
+          <w:color w:val="000000"/>
+          <w:sz w:val="24"/>
         </w:rPr>
+        <w:t>除主演示外，已有定向验证还检查输入停顿、错误码、错误位置和窗口边界。下表结果来自同一单星实现的保存日志；这些检查与本次重新运行的 13 轮演示分别列示。</w:t>
+      </w:r>
+    </w:p>
+    <w:tbl>
+      <w:tblPr>
+        <w:tblW w:type="auto" w:w="0"/>
+        <w:jc w:val="center"/>
+        <w:tblLayout w:type="fixed"/>
+        <w:tblLook w:firstColumn="1" w:firstRow="1" w:lastColumn="0" w:lastRow="0" w:noHBand="0" w:noVBand="1" w:val="04A0"/>
+        <w:tblBorders>
+          <w:top w:val="single" w:sz="4" w:color="D9D9D9"/>
+          <w:left w:val="single" w:sz="4" w:color="D9D9D9"/>
+          <w:bottom w:val="single" w:sz="4" w:color="D9D9D9"/>
+          <w:right w:val="single" w:sz="4" w:color="D9D9D9"/>
+          <w:insideH w:val="single" w:sz="4" w:color="D9D9D9"/>
+          <w:insideV w:val="single" w:sz="4" w:color="D9D9D9"/>
+        </w:tblBorders>
+        <w:tblCellMar>
+          <w:top w:w="75" w:type="dxa"/>
+          <w:bottom w:w="75" w:type="dxa"/>
+          <w:left w:w="100" w:type="dxa"/>
+          <w:right w:w="100" w:type="dxa"/>
+        </w:tblCellMar>
+      </w:tblPr>
+      <w:tblGrid>
+        <w:gridCol w:w="2665"/>
+        <w:gridCol w:w="6406"/>
+      </w:tblGrid>
+      <w:tr>
+        <w:trPr>
+          <w:cantSplit/>
+          <w:tblHeader/>
+        </w:trPr>
+        <w:tc>
+          <w:tcPr>
+            <w:tcW w:type="dxa" w:w="2665"/>
+            <w:vAlign w:val="center"/>
+            <w:shd w:fill="F2F2F2"/>
+          </w:tcPr>
+          <w:p>
+            <w:pPr>
+              <w:spacing w:after="0" w:line="280" w:lineRule="exact"/>
+              <w:ind w:firstLine="0"/>
+              <w:jc w:val="center"/>
+            </w:pPr>
+            <w:r>
+              <w:rPr>
+                <w:rFonts w:ascii="Times New Roman" w:hAnsi="Times New Roman" w:eastAsia="宋体"/>
+                <w:b/>
+                <w:color w:val="000000"/>
+                <w:sz w:val="21"/>
+              </w:rPr>
+              <w:t>检查项</w:t>
+            </w:r>
+          </w:p>
+        </w:tc>
+        <w:tc>
+          <w:tcPr>
+            <w:tcW w:type="dxa" w:w="6406"/>
+            <w:vAlign w:val="center"/>
+            <w:shd w:fill="F2F2F2"/>
+          </w:tcPr>
+          <w:p>
+            <w:pPr>
+              <w:spacing w:after="0" w:line="280" w:lineRule="exact"/>
+              <w:ind w:firstLine="0"/>
+              <w:jc w:val="center"/>
+            </w:pPr>
+            <w:r>
+              <w:rPr>
+                <w:rFonts w:ascii="Times New Roman" w:hAnsi="Times New Roman" w:eastAsia="宋体"/>
+                <w:b/>
+                <w:color w:val="000000"/>
+                <w:sz w:val="21"/>
+              </w:rPr>
+              <w:t>结果与说明</w:t>
+            </w:r>
+          </w:p>
+        </w:tc>
+      </w:tr>
+      <w:tr>
+        <w:trPr>
+          <w:cantSplit/>
+        </w:trPr>
+        <w:tc>
+          <w:tcPr>
+            <w:tcW w:type="dxa" w:w="2665"/>
+            <w:vAlign w:val="center"/>
+          </w:tcPr>
+          <w:p>
+            <w:pPr>
+              <w:spacing w:after="0" w:line="280" w:lineRule="exact"/>
+              <w:ind w:firstLine="0"/>
+              <w:jc w:val="left"/>
+            </w:pPr>
+            <w:r>
+              <w:rPr>
+                <w:rFonts w:ascii="Times New Roman" w:hAnsi="Times New Roman" w:eastAsia="宋体"/>
+                <w:b w:val="0"/>
+                <w:color w:val="000000"/>
+                <w:sz w:val="21"/>
+              </w:rPr>
+              <w:t>输入中插入停顿</w:t>
+            </w:r>
+          </w:p>
+        </w:tc>
+        <w:tc>
+          <w:tcPr>
+            <w:tcW w:type="dxa" w:w="6406"/>
+            <w:vAlign w:val="center"/>
+          </w:tcPr>
+          <w:p>
+            <w:pPr>
+              <w:spacing w:after="0" w:line="280" w:lineRule="exact"/>
+              <w:ind w:firstLine="0"/>
+              <w:jc w:val="left"/>
+            </w:pPr>
+            <w:r>
+              <w:rPr>
+                <w:rFonts w:ascii="Times New Roman" w:hAnsi="Times New Roman" w:eastAsia="宋体"/>
+                <w:b w:val="0"/>
+                <w:color w:val="000000"/>
+                <w:sz w:val="21"/>
+              </w:rPr>
+              <w:t>累计有效样本数及逐轮结果与连续输入一致</w:t>
+            </w:r>
+          </w:p>
+        </w:tc>
+      </w:tr>
+      <w:tr>
+        <w:trPr>
+          <w:cantSplit/>
+        </w:trPr>
+        <w:tc>
+          <w:tcPr>
+            <w:tcW w:type="dxa" w:w="2665"/>
+            <w:vAlign w:val="center"/>
+          </w:tcPr>
+          <w:p>
+            <w:pPr>
+              <w:spacing w:after="0" w:line="280" w:lineRule="exact"/>
+              <w:ind w:firstLine="0"/>
+              <w:jc w:val="left"/>
+            </w:pPr>
+            <w:r>
+              <w:rPr>
+                <w:rFonts w:ascii="Times New Roman" w:hAnsi="Times New Roman" w:eastAsia="宋体"/>
+                <w:b w:val="0"/>
+                <w:color w:val="000000"/>
+                <w:sz w:val="21"/>
+              </w:rPr>
+              <w:t>错误 PRN 5</w:t>
+            </w:r>
+          </w:p>
+        </w:tc>
+        <w:tc>
+          <w:tcPr>
+            <w:tcW w:type="dxa" w:w="6406"/>
+            <w:vAlign w:val="center"/>
+          </w:tcPr>
+          <w:p>
+            <w:pPr>
+              <w:spacing w:after="0" w:line="280" w:lineRule="exact"/>
+              <w:ind w:firstLine="0"/>
+              <w:jc w:val="left"/>
+            </w:pPr>
+            <w:r>
+              <w:rPr>
+                <w:rFonts w:ascii="Times New Roman" w:hAnsi="Times New Roman" w:eastAsia="宋体"/>
+                <w:b w:val="0"/>
+                <w:color w:val="000000"/>
+                <w:sz w:val="21"/>
+              </w:rPr>
+              <w:t>所观察的 13 轮中未触发捕获</w:t>
+            </w:r>
+          </w:p>
+        </w:tc>
+      </w:tr>
+      <w:tr>
+        <w:trPr>
+          <w:cantSplit/>
+        </w:trPr>
+        <w:tc>
+          <w:tcPr>
+            <w:tcW w:type="dxa" w:w="2665"/>
+            <w:vAlign w:val="center"/>
+          </w:tcPr>
+          <w:p>
+            <w:pPr>
+              <w:spacing w:after="0" w:line="280" w:lineRule="exact"/>
+              <w:ind w:firstLine="0"/>
+              <w:jc w:val="left"/>
+            </w:pPr>
+            <w:r>
+              <w:rPr>
+                <w:rFonts w:ascii="Times New Roman" w:hAnsi="Times New Roman" w:eastAsia="宋体"/>
+                <w:b w:val="0"/>
+                <w:color w:val="000000"/>
+                <w:sz w:val="21"/>
+              </w:rPr>
+              <w:t>固定错误位置 0</w:t>
+            </w:r>
+          </w:p>
+        </w:tc>
+        <w:tc>
+          <w:tcPr>
+            <w:tcW w:type="dxa" w:w="6406"/>
+            <w:vAlign w:val="center"/>
+          </w:tcPr>
+          <w:p>
+            <w:pPr>
+              <w:spacing w:after="0" w:line="280" w:lineRule="exact"/>
+              <w:ind w:firstLine="0"/>
+              <w:jc w:val="left"/>
+            </w:pPr>
+            <w:r>
+              <w:rPr>
+                <w:rFonts w:ascii="Times New Roman" w:hAnsi="Times New Roman" w:eastAsia="宋体"/>
+                <w:b w:val="0"/>
+                <w:color w:val="000000"/>
+                <w:sz w:val="21"/>
+              </w:rPr>
+              <w:t>所观察的 13 轮中未触发捕获</w:t>
+            </w:r>
+          </w:p>
+        </w:tc>
+      </w:tr>
+      <w:tr>
+        <w:trPr>
+          <w:cantSplit/>
+        </w:trPr>
+        <w:tc>
+          <w:tcPr>
+            <w:tcW w:type="dxa" w:w="2665"/>
+            <w:vAlign w:val="center"/>
+          </w:tcPr>
+          <w:p>
+            <w:pPr>
+              <w:spacing w:after="0" w:line="280" w:lineRule="exact"/>
+              <w:ind w:firstLine="0"/>
+              <w:jc w:val="left"/>
+            </w:pPr>
+            <w:r>
+              <w:rPr>
+                <w:rFonts w:ascii="Times New Roman" w:hAnsi="Times New Roman" w:eastAsia="宋体"/>
+                <w:b w:val="0"/>
+                <w:color w:val="000000"/>
+                <w:sz w:val="21"/>
+              </w:rPr>
+              <w:t>零输入</w:t>
+            </w:r>
+          </w:p>
+        </w:tc>
+        <w:tc>
+          <w:tcPr>
+            <w:tcW w:type="dxa" w:w="6406"/>
+            <w:vAlign w:val="center"/>
+          </w:tcPr>
+          <w:p>
+            <w:pPr>
+              <w:spacing w:after="0" w:line="280" w:lineRule="exact"/>
+              <w:ind w:firstLine="0"/>
+              <w:jc w:val="left"/>
+            </w:pPr>
+            <w:r>
+              <w:rPr>
+                <w:rFonts w:ascii="Times New Roman" w:hAnsi="Times New Roman" w:eastAsia="宋体"/>
+                <w:b w:val="0"/>
+                <w:color w:val="000000"/>
+                <w:sz w:val="21"/>
+              </w:rPr>
+              <w:t>未触发捕获</w:t>
+            </w:r>
+          </w:p>
+        </w:tc>
+      </w:tr>
+      <w:tr>
+        <w:trPr>
+          <w:cantSplit/>
+        </w:trPr>
+        <w:tc>
+          <w:tcPr>
+            <w:tcW w:type="dxa" w:w="2665"/>
+            <w:vAlign w:val="center"/>
+          </w:tcPr>
+          <w:p>
+            <w:pPr>
+              <w:spacing w:after="0" w:line="280" w:lineRule="exact"/>
+              <w:ind w:firstLine="0"/>
+              <w:jc w:val="left"/>
+            </w:pPr>
+            <w:r>
+              <w:rPr>
+                <w:rFonts w:ascii="Times New Roman" w:hAnsi="Times New Roman" w:eastAsia="宋体"/>
+                <w:b w:val="0"/>
+                <w:color w:val="000000"/>
+                <w:sz w:val="21"/>
+              </w:rPr>
+              <w:t>末样本与门限等号</w:t>
+            </w:r>
+          </w:p>
+        </w:tc>
+        <w:tc>
+          <w:tcPr>
+            <w:tcW w:type="dxa" w:w="6406"/>
+            <w:vAlign w:val="center"/>
+          </w:tcPr>
+          <w:p>
+            <w:pPr>
+              <w:spacing w:after="0" w:line="280" w:lineRule="exact"/>
+              <w:ind w:firstLine="0"/>
+              <w:jc w:val="left"/>
+            </w:pPr>
+            <w:r>
+              <w:rPr>
+                <w:rFonts w:ascii="Times New Roman" w:hAnsi="Times New Roman" w:eastAsia="宋体"/>
+                <w:b w:val="0"/>
+                <w:color w:val="000000"/>
+                <w:sz w:val="21"/>
+              </w:rPr>
+              <w:t>最后一个非零样本计入后能量为 49；门限设为 49 时成功</w:t>
+            </w:r>
+          </w:p>
+        </w:tc>
+      </w:tr>
+      <w:tr>
+        <w:trPr>
+          <w:cantSplit/>
+        </w:trPr>
+        <w:tc>
+          <w:tcPr>
+            <w:tcW w:type="dxa" w:w="2665"/>
+            <w:vAlign w:val="center"/>
+          </w:tcPr>
+          <w:p>
+            <w:pPr>
+              <w:spacing w:after="0" w:line="280" w:lineRule="exact"/>
+              <w:ind w:firstLine="0"/>
+              <w:jc w:val="left"/>
+            </w:pPr>
+            <w:r>
+              <w:rPr>
+                <w:rFonts w:ascii="Times New Roman" w:hAnsi="Times New Roman" w:eastAsia="宋体"/>
+                <w:b w:val="0"/>
+                <w:color w:val="000000"/>
+                <w:sz w:val="21"/>
+              </w:rPr>
+              <w:t>保持 重启与复位</w:t>
+            </w:r>
+          </w:p>
+        </w:tc>
+        <w:tc>
+          <w:tcPr>
+            <w:tcW w:type="dxa" w:w="6406"/>
+            <w:vAlign w:val="center"/>
+          </w:tcPr>
+          <w:p>
+            <w:pPr>
+              <w:spacing w:after="0" w:line="280" w:lineRule="exact"/>
+              <w:ind w:firstLine="0"/>
+              <w:jc w:val="left"/>
+            </w:pPr>
+            <w:r>
+              <w:rPr>
+                <w:rFonts w:ascii="Times New Roman" w:hAnsi="Times New Roman" w:eastAsia="宋体"/>
+                <w:b w:val="0"/>
+                <w:color w:val="000000"/>
+                <w:sz w:val="21"/>
+              </w:rPr>
+              <w:t>无效拍不推进；成功保持；重启和复位清除状态</w:t>
+            </w:r>
+          </w:p>
+        </w:tc>
+      </w:tr>
+      <w:tr>
+        <w:trPr>
+          <w:cantSplit/>
+        </w:trPr>
+        <w:tc>
+          <w:tcPr>
+            <w:tcW w:type="dxa" w:w="2665"/>
+            <w:vAlign w:val="center"/>
+          </w:tcPr>
+          <w:p>
+            <w:pPr>
+              <w:spacing w:after="0" w:line="280" w:lineRule="exact"/>
+              <w:ind w:firstLine="0"/>
+              <w:jc w:val="left"/>
+            </w:pPr>
+            <w:r>
+              <w:rPr>
+                <w:rFonts w:ascii="Times New Roman" w:hAnsi="Times New Roman" w:eastAsia="宋体"/>
+                <w:b w:val="0"/>
+                <w:color w:val="000000"/>
+                <w:sz w:val="21"/>
+              </w:rPr>
+              <w:t>原并行引擎接入教师源</w:t>
+            </w:r>
+          </w:p>
+        </w:tc>
+        <w:tc>
+          <w:tcPr>
+            <w:tcW w:type="dxa" w:w="6406"/>
+            <w:vAlign w:val="center"/>
+          </w:tcPr>
+          <w:p>
+            <w:pPr>
+              <w:spacing w:after="0" w:line="280" w:lineRule="exact"/>
+              <w:ind w:firstLine="0"/>
+              <w:jc w:val="left"/>
+            </w:pPr>
+            <w:r>
+              <w:rPr>
+                <w:rFonts w:ascii="Times New Roman" w:hAnsi="Times New Roman" w:eastAsia="宋体"/>
+                <w:b w:val="0"/>
+                <w:color w:val="000000"/>
+                <w:sz w:val="21"/>
+              </w:rPr>
+              <w:t>found=1；半码片位置 20；多普勒字 0</w:t>
+            </w:r>
+          </w:p>
+        </w:tc>
+      </w:tr>
+    </w:tbl>
+    <w:p>
+      <w:pPr>
+        <w:spacing w:after="80" w:line="360" w:lineRule="exact" w:before="100"/>
+        <w:ind w:firstLine="482"/>
+        <w:jc w:val="both"/>
       </w:pPr>
+      <w:r>
+        <w:rPr>
+          <w:rFonts w:ascii="Times New Roman" w:hAnsi="Times New Roman" w:eastAsia="宋体"/>
+          <w:b w:val="0"/>
+          <w:color w:val="000000"/>
+          <w:sz w:val="24"/>
+        </w:rPr>
+        <w:t>原并行引擎的半码片位置 20 与单星模块的整码片位置 10 表示同一相位偏移。两种模块采用不同搜索结构和统计量，该对照说明原工程能够使用同一教师源，但不将原引擎的幅度判据数值直接视为本报告的平方能量。</w:t>
+      </w:r>
     </w:p>
     <w:p>
       <w:pPr>
         <w:pStyle w:val="21"/>
-        <w:rPr>
-          <w:lang w:eastAsia="zh-CN"/>
-        </w:rPr>
+        <w:pageBreakBefore w:val="0"/>
       </w:pPr>
       <w:r>
-        <w:rPr>
-          <w:rFonts w:ascii="Times New Roman" w:eastAsia="黑体" w:hAnsi="Times New Roman"/>
-          <w:lang w:eastAsia="zh-CN"/>
-        </w:rPr>
-        <w:t xml:space="preserve">2.4 实验结果与分析</w:t>
-      </w:r>
-      <w:r>
-        <w:rPr>
-          <w:rFonts w:ascii="Times New Roman" w:eastAsia="黑体" w:hAnsi="Times New Roman"/>
-          <w:lang w:eastAsia="zh-CN"/>
-        </w:rPr>
-        <w:t/>
+        <w:t>7.1 结果解释与验证边界</w:t>
       </w:r>
     </w:p>
     <w:p>
       <w:pPr>
-        <w:spacing w:after="720" w:line="240" w:lineRule="auto"/>
+        <w:spacing w:after="80" w:line="360" w:lineRule="exact"/>
         <w:ind w:firstLine="482"/>
         <w:jc w:val="both"/>
+      </w:pPr>
+      <w:r>
         <w:rPr>
-          <w:lang w:eastAsia="zh-CN"/>
+          <w:rFonts w:ascii="Times New Roman" w:hAnsi="Times New Roman" w:eastAsia="宋体"/>
+          <w:b w:val="0"/>
+          <w:color w:val="000000"/>
+          <w:sz w:val="24"/>
         </w:rPr>
+        <w:t>未对齐时，本地码造成正负贡献相互抵消，相关累加值较小；对齐后有效贡献同向累加，产生明显能量峰。采用两路平方和后，NH 引起的符号变化不会改变本场景的能量判据。位置搜索、样本计数和结果锁存与波形显示具有一致的时间关系。</w:t>
+      </w:r>
+    </w:p>
+    <w:p>
+      <w:pPr>
+        <w:spacing w:after="80" w:line="360" w:lineRule="exact"/>
+        <w:ind w:firstLine="482"/>
+        <w:jc w:val="both"/>
       </w:pPr>
+      <w:r>
+        <w:rPr>
+          <w:rFonts w:ascii="Times New Roman" w:hAnsi="Times New Roman" w:eastAsia="宋体"/>
+          <w:b w:val="0"/>
+          <w:color w:val="000000"/>
+          <w:sz w:val="24"/>
+        </w:rPr>
+        <w:t>补充反例只能说明所测试条件下没有误捕获，不能替代虚警率与检出率的统计试验。单星源没有噪声和多普勒偏差；完整公开 100 s 文件的 RTL 六星接收、动态性能及工艺综合结论仍需单独验证。</w:t>
+      </w:r>
+    </w:p>
+    <w:p>
+      <w:pPr>
+        <w:pStyle w:val="21"/>
+        <w:pageBreakBefore w:val="0"/>
+      </w:pPr>
+      <w:r>
+        <w:t>7.2 实验结论</w:t>
+      </w:r>
+    </w:p>
+    <w:p>
+      <w:pPr>
+        <w:spacing w:after="80" w:line="360" w:lineRule="exact"/>
+        <w:ind w:firstLine="482"/>
+        <w:jc w:val="both"/>
+      </w:pPr>
+      <w:r>
+        <w:rPr>
+          <w:rFonts w:ascii="Times New Roman" w:hAnsi="Times New Roman" w:eastAsia="宋体"/>
+          <w:b w:val="0"/>
+          <w:color w:val="000000"/>
+          <w:sz w:val="24"/>
+        </w:rPr>
+        <w:t>原捕获定向用例完成目标检出、缺席码拒判及捕获后移交；公开数据的软件参考检出六颗卫星。本次单星 RTL 仿真在第 11 轮找到位置 10，对齐能量为最大未对齐能量的 961 倍，并经两个后续窗口逐样本核对，达到本次捕获演示的验收目标。</w:t>
+      </w:r>
     </w:p>
     <w:sectPr>
       <w:headerReference w:type="default" r:id="rId13"/>

</xml_diff>